<commit_message>
[Mubasshera Rizvi] changed report
</commit_message>
<xml_diff>
--- a/05_Framework_Design/Framework_Design.docx
+++ b/05_Framework_Design/Framework_Design.docx
@@ -1,6 +1,6 @@
 
 <file path=word/document.xml><?xml version="1.0" encoding="utf-8"?>
-<w:document xmlns:wpc="http://schemas.microsoft.com/office/word/2010/wordprocessingCanvas" xmlns:cx="http://schemas.microsoft.com/office/drawing/2014/chartex" xmlns:cx1="http://schemas.microsoft.com/office/drawing/2015/9/8/chartex" xmlns:cx2="http://schemas.microsoft.com/office/drawing/2015/10/21/chartex" xmlns:cx3="http://schemas.microsoft.com/office/drawing/2016/5/9/chartex" xmlns:cx4="http://schemas.microsoft.com/office/drawing/2016/5/10/chartex" xmlns:cx5="http://schemas.microsoft.com/office/drawing/2016/5/11/chartex" xmlns:cx6="http://schemas.microsoft.com/office/drawing/2016/5/12/chartex" xmlns:cx7="http://schemas.microsoft.com/office/drawing/2016/5/13/chartex" xmlns:cx8="http://schemas.microsoft.com/office/drawing/2016/5/14/chartex" xmlns:mc="http://schemas.openxmlformats.org/markup-compatibility/2006" xmlns:aink="http://schemas.microsoft.com/office/drawing/2016/ink" xmlns:am3d="http://schemas.microsoft.com/office/drawing/2017/model3d" xmlns:o="urn:schemas-microsoft-com:office:office" xmlns:oel="http://schemas.microsoft.com/office/2019/extlst" xmlns:r="http://schemas.openxmlformats.org/officeDocument/2006/relationships" xmlns:m="http://schemas.openxmlformats.org/officeDocument/2006/math" xmlns:v="urn:schemas-microsoft-com:vml" xmlns:wp14="http://schemas.microsoft.com/office/word/2010/wordprocessingDrawing" xmlns:wp="http://schemas.openxmlformats.org/drawingml/2006/wordprocessingDrawing" xmlns:w10="urn:schemas-microsoft-com:office:word" xmlns:w="http://schemas.openxmlformats.org/wordprocessingml/2006/main" xmlns:w14="http://schemas.microsoft.com/office/word/2010/wordml" xmlns:w15="http://schemas.microsoft.com/office/word/2012/wordml" xmlns:w16cex="http://schemas.microsoft.com/office/word/2018/wordml/cex" xmlns:w16cid="http://schemas.microsoft.com/office/word/2016/wordml/cid" xmlns:w16="http://schemas.microsoft.com/office/word/2018/wordml" xmlns:w16du="http://schemas.microsoft.com/office/word/2023/wordml/word16du" xmlns:w16sdtdh="http://schemas.microsoft.com/office/word/2020/wordml/sdtdatahash" xmlns:w16sdtfl="http://schemas.microsoft.com/office/word/2024/wordml/sdtformatlock" xmlns:w16se="http://schemas.microsoft.com/office/word/2015/wordml/symex" xmlns:wpg="http://schemas.microsoft.com/office/word/2010/wordprocessingGroup" xmlns:wpi="http://schemas.microsoft.com/office/word/2010/wordprocessingInk" xmlns:wne="http://schemas.microsoft.com/office/word/2006/wordml" xmlns:wps="http://schemas.microsoft.com/office/word/2010/wordprocessingShape" mc:Ignorable="w14 w15 w16se w16cid w16 w16cex w16sdtdh w16sdtfl w16du wp14">
+<w:document xmlns:ve="http://schemas.openxmlformats.org/markup-compatibility/2006" xmlns:o="urn:schemas-microsoft-com:office:office" xmlns:r="http://schemas.openxmlformats.org/officeDocument/2006/relationships" xmlns:m="http://schemas.openxmlformats.org/officeDocument/2006/math" xmlns:v="urn:schemas-microsoft-com:vml" xmlns:wp="http://schemas.openxmlformats.org/drawingml/2006/wordprocessingDrawing" xmlns:w10="urn:schemas-microsoft-com:office:word" xmlns:w="http://schemas.openxmlformats.org/wordprocessingml/2006/main" xmlns:wne="http://schemas.microsoft.com/office/word/2006/wordml">
   <w:body>
     <w:p>
       <w:pPr>
@@ -49,9 +49,6 @@
     <w:p>
       <w:pPr>
         <w:spacing w:after="0" w:line="240" w:lineRule="auto"/>
-        <w:rPr>
-          <w:rFonts w:hint="eastAsia"/>
-        </w:rPr>
       </w:pPr>
       <w:r>
         <w:rPr>
@@ -63,21 +60,12 @@
     <w:p>
       <w:pPr>
         <w:spacing w:after="0" w:line="240" w:lineRule="auto"/>
-        <w:rPr>
-          <w:rFonts w:hint="eastAsia"/>
-        </w:rPr>
       </w:pPr>
       <w:r>
         <w:rPr>
           <w:rFonts w:hint="eastAsia"/>
         </w:rPr>
         <w:t>├──</w:t>
-      </w:r>
-      <w:r>
-        <w:rPr>
-          <w:rFonts w:hint="eastAsia"/>
-        </w:rPr>
-        <w:t xml:space="preserve"> </w:t>
       </w:r>
       <w:proofErr w:type="spellStart"/>
       <w:r>
@@ -97,27 +85,12 @@
     <w:p>
       <w:pPr>
         <w:spacing w:after="0" w:line="240" w:lineRule="auto"/>
-        <w:rPr>
-          <w:rFonts w:hint="eastAsia"/>
-        </w:rPr>
       </w:pPr>
       <w:r>
         <w:rPr>
           <w:rFonts w:hint="eastAsia"/>
         </w:rPr>
-        <w:t>│</w:t>
-      </w:r>
-      <w:r>
-        <w:rPr>
-          <w:rFonts w:hint="eastAsia"/>
-        </w:rPr>
-        <w:t xml:space="preserve">   </w:t>
-      </w:r>
-      <w:r>
-        <w:rPr>
-          <w:rFonts w:hint="eastAsia"/>
-        </w:rPr>
-        <w:t>├──</w:t>
+        <w:t>│├──</w:t>
       </w:r>
       <w:r>
         <w:rPr>
@@ -129,39 +102,12 @@
     <w:p>
       <w:pPr>
         <w:spacing w:after="0" w:line="240" w:lineRule="auto"/>
-        <w:rPr>
-          <w:rFonts w:hint="eastAsia"/>
-        </w:rPr>
       </w:pPr>
       <w:r>
         <w:rPr>
           <w:rFonts w:hint="eastAsia"/>
         </w:rPr>
-        <w:t>│</w:t>
-      </w:r>
-      <w:r>
-        <w:rPr>
-          <w:rFonts w:hint="eastAsia"/>
-        </w:rPr>
-        <w:t xml:space="preserve">   </w:t>
-      </w:r>
-      <w:r>
-        <w:rPr>
-          <w:rFonts w:hint="eastAsia"/>
-        </w:rPr>
-        <w:t>│</w:t>
-      </w:r>
-      <w:r>
-        <w:rPr>
-          <w:rFonts w:hint="eastAsia"/>
-        </w:rPr>
-        <w:t xml:space="preserve">   </w:t>
-      </w:r>
-      <w:r>
-        <w:rPr>
-          <w:rFonts w:hint="eastAsia"/>
-        </w:rPr>
-        <w:t>└──</w:t>
+        <w:t>││└──</w:t>
       </w:r>
       <w:r>
         <w:rPr>
@@ -173,53 +119,23 @@
     <w:p>
       <w:pPr>
         <w:spacing w:after="0" w:line="240" w:lineRule="auto"/>
-        <w:rPr>
-          <w:rFonts w:hint="eastAsia"/>
-        </w:rPr>
       </w:pPr>
       <w:r>
         <w:rPr>
           <w:rFonts w:hint="eastAsia"/>
         </w:rPr>
-        <w:t>│</w:t>
-      </w:r>
-      <w:r>
-        <w:rPr>
-          <w:rFonts w:hint="eastAsia"/>
-        </w:rPr>
-        <w:t xml:space="preserve">   </w:t>
-      </w:r>
-      <w:r>
-        <w:rPr>
-          <w:rFonts w:hint="eastAsia"/>
-        </w:rPr>
-        <w:t>│</w:t>
+        <w:t>││</w:t>
       </w:r>
     </w:p>
     <w:p>
       <w:pPr>
         <w:spacing w:after="0" w:line="240" w:lineRule="auto"/>
-        <w:rPr>
-          <w:rFonts w:hint="eastAsia"/>
-        </w:rPr>
       </w:pPr>
       <w:r>
         <w:rPr>
           <w:rFonts w:hint="eastAsia"/>
         </w:rPr>
-        <w:t>│</w:t>
-      </w:r>
-      <w:r>
-        <w:rPr>
-          <w:rFonts w:hint="eastAsia"/>
-        </w:rPr>
-        <w:t xml:space="preserve">   </w:t>
-      </w:r>
-      <w:r>
-        <w:rPr>
-          <w:rFonts w:hint="eastAsia"/>
-        </w:rPr>
-        <w:t>├──</w:t>
+        <w:t>│├──</w:t>
       </w:r>
       <w:r>
         <w:rPr>
@@ -231,39 +147,12 @@
     <w:p>
       <w:pPr>
         <w:spacing w:after="0" w:line="240" w:lineRule="auto"/>
-        <w:rPr>
-          <w:rFonts w:hint="eastAsia"/>
-        </w:rPr>
       </w:pPr>
       <w:r>
         <w:rPr>
           <w:rFonts w:hint="eastAsia"/>
         </w:rPr>
-        <w:t>│</w:t>
-      </w:r>
-      <w:r>
-        <w:rPr>
-          <w:rFonts w:hint="eastAsia"/>
-        </w:rPr>
-        <w:t xml:space="preserve">   </w:t>
-      </w:r>
-      <w:r>
-        <w:rPr>
-          <w:rFonts w:hint="eastAsia"/>
-        </w:rPr>
-        <w:t>│</w:t>
-      </w:r>
-      <w:r>
-        <w:rPr>
-          <w:rFonts w:hint="eastAsia"/>
-        </w:rPr>
-        <w:t xml:space="preserve">   </w:t>
-      </w:r>
-      <w:r>
-        <w:rPr>
-          <w:rFonts w:hint="eastAsia"/>
-        </w:rPr>
-        <w:t>├──</w:t>
+        <w:t>││├──</w:t>
       </w:r>
       <w:r>
         <w:rPr>
@@ -275,39 +164,12 @@
     <w:p>
       <w:pPr>
         <w:spacing w:after="0" w:line="240" w:lineRule="auto"/>
-        <w:rPr>
-          <w:rFonts w:hint="eastAsia"/>
-        </w:rPr>
       </w:pPr>
       <w:r>
         <w:rPr>
           <w:rFonts w:hint="eastAsia"/>
         </w:rPr>
-        <w:t>│</w:t>
-      </w:r>
-      <w:r>
-        <w:rPr>
-          <w:rFonts w:hint="eastAsia"/>
-        </w:rPr>
-        <w:t xml:space="preserve">   </w:t>
-      </w:r>
-      <w:r>
-        <w:rPr>
-          <w:rFonts w:hint="eastAsia"/>
-        </w:rPr>
-        <w:t>│</w:t>
-      </w:r>
-      <w:r>
-        <w:rPr>
-          <w:rFonts w:hint="eastAsia"/>
-        </w:rPr>
-        <w:t xml:space="preserve">   </w:t>
-      </w:r>
-      <w:r>
-        <w:rPr>
-          <w:rFonts w:hint="eastAsia"/>
-        </w:rPr>
-        <w:t>├──</w:t>
+        <w:t>││├──</w:t>
       </w:r>
       <w:r>
         <w:rPr>
@@ -319,39 +181,12 @@
     <w:p>
       <w:pPr>
         <w:spacing w:after="0" w:line="240" w:lineRule="auto"/>
-        <w:rPr>
-          <w:rFonts w:hint="eastAsia"/>
-        </w:rPr>
       </w:pPr>
       <w:r>
         <w:rPr>
           <w:rFonts w:hint="eastAsia"/>
         </w:rPr>
-        <w:t>│</w:t>
-      </w:r>
-      <w:r>
-        <w:rPr>
-          <w:rFonts w:hint="eastAsia"/>
-        </w:rPr>
-        <w:t xml:space="preserve">   </w:t>
-      </w:r>
-      <w:r>
-        <w:rPr>
-          <w:rFonts w:hint="eastAsia"/>
-        </w:rPr>
-        <w:t>│</w:t>
-      </w:r>
-      <w:r>
-        <w:rPr>
-          <w:rFonts w:hint="eastAsia"/>
-        </w:rPr>
-        <w:t xml:space="preserve">   </w:t>
-      </w:r>
-      <w:r>
-        <w:rPr>
-          <w:rFonts w:hint="eastAsia"/>
-        </w:rPr>
-        <w:t>├──</w:t>
+        <w:t>││├──</w:t>
       </w:r>
       <w:r>
         <w:rPr>
@@ -363,39 +198,12 @@
     <w:p>
       <w:pPr>
         <w:spacing w:after="0" w:line="240" w:lineRule="auto"/>
-        <w:rPr>
-          <w:rFonts w:hint="eastAsia"/>
-        </w:rPr>
       </w:pPr>
       <w:r>
         <w:rPr>
           <w:rFonts w:hint="eastAsia"/>
         </w:rPr>
-        <w:t>│</w:t>
-      </w:r>
-      <w:r>
-        <w:rPr>
-          <w:rFonts w:hint="eastAsia"/>
-        </w:rPr>
-        <w:t xml:space="preserve">   </w:t>
-      </w:r>
-      <w:r>
-        <w:rPr>
-          <w:rFonts w:hint="eastAsia"/>
-        </w:rPr>
-        <w:t>│</w:t>
-      </w:r>
-      <w:r>
-        <w:rPr>
-          <w:rFonts w:hint="eastAsia"/>
-        </w:rPr>
-        <w:t xml:space="preserve">   </w:t>
-      </w:r>
-      <w:r>
-        <w:rPr>
-          <w:rFonts w:hint="eastAsia"/>
-        </w:rPr>
-        <w:t>└──</w:t>
+        <w:t>││└──</w:t>
       </w:r>
       <w:r>
         <w:rPr>
@@ -407,53 +215,23 @@
     <w:p>
       <w:pPr>
         <w:spacing w:after="0" w:line="240" w:lineRule="auto"/>
-        <w:rPr>
-          <w:rFonts w:hint="eastAsia"/>
-        </w:rPr>
       </w:pPr>
       <w:r>
         <w:rPr>
           <w:rFonts w:hint="eastAsia"/>
         </w:rPr>
-        <w:t>│</w:t>
-      </w:r>
-      <w:r>
-        <w:rPr>
-          <w:rFonts w:hint="eastAsia"/>
-        </w:rPr>
-        <w:t xml:space="preserve">   </w:t>
-      </w:r>
-      <w:r>
-        <w:rPr>
-          <w:rFonts w:hint="eastAsia"/>
-        </w:rPr>
-        <w:t>│</w:t>
+        <w:t>││</w:t>
       </w:r>
     </w:p>
     <w:p>
       <w:pPr>
         <w:spacing w:after="0" w:line="240" w:lineRule="auto"/>
-        <w:rPr>
-          <w:rFonts w:hint="eastAsia"/>
-        </w:rPr>
       </w:pPr>
       <w:r>
         <w:rPr>
           <w:rFonts w:hint="eastAsia"/>
         </w:rPr>
-        <w:t>│</w:t>
-      </w:r>
-      <w:r>
-        <w:rPr>
-          <w:rFonts w:hint="eastAsia"/>
-        </w:rPr>
-        <w:t xml:space="preserve">   </w:t>
-      </w:r>
-      <w:r>
-        <w:rPr>
-          <w:rFonts w:hint="eastAsia"/>
-        </w:rPr>
-        <w:t>├──</w:t>
+        <w:t>│├──</w:t>
       </w:r>
       <w:r>
         <w:rPr>
@@ -465,39 +243,12 @@
     <w:p>
       <w:pPr>
         <w:spacing w:after="0" w:line="240" w:lineRule="auto"/>
-        <w:rPr>
-          <w:rFonts w:hint="eastAsia"/>
-        </w:rPr>
       </w:pPr>
       <w:r>
         <w:rPr>
           <w:rFonts w:hint="eastAsia"/>
         </w:rPr>
-        <w:t>│</w:t>
-      </w:r>
-      <w:r>
-        <w:rPr>
-          <w:rFonts w:hint="eastAsia"/>
-        </w:rPr>
-        <w:t xml:space="preserve">   </w:t>
-      </w:r>
-      <w:r>
-        <w:rPr>
-          <w:rFonts w:hint="eastAsia"/>
-        </w:rPr>
-        <w:t>│</w:t>
-      </w:r>
-      <w:r>
-        <w:rPr>
-          <w:rFonts w:hint="eastAsia"/>
-        </w:rPr>
-        <w:t xml:space="preserve">   </w:t>
-      </w:r>
-      <w:r>
-        <w:rPr>
-          <w:rFonts w:hint="eastAsia"/>
-        </w:rPr>
-        <w:t>├──</w:t>
+        <w:t>││├──</w:t>
       </w:r>
       <w:r>
         <w:rPr>
@@ -509,39 +260,12 @@
     <w:p>
       <w:pPr>
         <w:spacing w:after="0" w:line="240" w:lineRule="auto"/>
-        <w:rPr>
-          <w:rFonts w:hint="eastAsia"/>
-        </w:rPr>
       </w:pPr>
       <w:r>
         <w:rPr>
           <w:rFonts w:hint="eastAsia"/>
         </w:rPr>
-        <w:t>│</w:t>
-      </w:r>
-      <w:r>
-        <w:rPr>
-          <w:rFonts w:hint="eastAsia"/>
-        </w:rPr>
-        <w:t xml:space="preserve">   </w:t>
-      </w:r>
-      <w:r>
-        <w:rPr>
-          <w:rFonts w:hint="eastAsia"/>
-        </w:rPr>
-        <w:t>│</w:t>
-      </w:r>
-      <w:r>
-        <w:rPr>
-          <w:rFonts w:hint="eastAsia"/>
-        </w:rPr>
-        <w:t xml:space="preserve">   </w:t>
-      </w:r>
-      <w:r>
-        <w:rPr>
-          <w:rFonts w:hint="eastAsia"/>
-        </w:rPr>
-        <w:t>├──</w:t>
+        <w:t>││├──</w:t>
       </w:r>
       <w:r>
         <w:rPr>
@@ -553,39 +277,12 @@
     <w:p>
       <w:pPr>
         <w:spacing w:after="0" w:line="240" w:lineRule="auto"/>
-        <w:rPr>
-          <w:rFonts w:hint="eastAsia"/>
-        </w:rPr>
       </w:pPr>
       <w:r>
         <w:rPr>
           <w:rFonts w:hint="eastAsia"/>
         </w:rPr>
-        <w:t>│</w:t>
-      </w:r>
-      <w:r>
-        <w:rPr>
-          <w:rFonts w:hint="eastAsia"/>
-        </w:rPr>
-        <w:t xml:space="preserve">   </w:t>
-      </w:r>
-      <w:r>
-        <w:rPr>
-          <w:rFonts w:hint="eastAsia"/>
-        </w:rPr>
-        <w:t>│</w:t>
-      </w:r>
-      <w:r>
-        <w:rPr>
-          <w:rFonts w:hint="eastAsia"/>
-        </w:rPr>
-        <w:t xml:space="preserve">   </w:t>
-      </w:r>
-      <w:r>
-        <w:rPr>
-          <w:rFonts w:hint="eastAsia"/>
-        </w:rPr>
-        <w:t>└──</w:t>
+        <w:t>││└──</w:t>
       </w:r>
       <w:r>
         <w:rPr>
@@ -597,53 +294,23 @@
     <w:p>
       <w:pPr>
         <w:spacing w:after="0" w:line="240" w:lineRule="auto"/>
-        <w:rPr>
-          <w:rFonts w:hint="eastAsia"/>
-        </w:rPr>
       </w:pPr>
       <w:r>
         <w:rPr>
           <w:rFonts w:hint="eastAsia"/>
         </w:rPr>
-        <w:t>│</w:t>
-      </w:r>
-      <w:r>
-        <w:rPr>
-          <w:rFonts w:hint="eastAsia"/>
-        </w:rPr>
-        <w:t xml:space="preserve">   </w:t>
-      </w:r>
-      <w:r>
-        <w:rPr>
-          <w:rFonts w:hint="eastAsia"/>
-        </w:rPr>
-        <w:t>│</w:t>
+        <w:t>││</w:t>
       </w:r>
     </w:p>
     <w:p>
       <w:pPr>
         <w:spacing w:after="0" w:line="240" w:lineRule="auto"/>
-        <w:rPr>
-          <w:rFonts w:hint="eastAsia"/>
-        </w:rPr>
       </w:pPr>
       <w:r>
         <w:rPr>
           <w:rFonts w:hint="eastAsia"/>
         </w:rPr>
-        <w:t>│</w:t>
-      </w:r>
-      <w:r>
-        <w:rPr>
-          <w:rFonts w:hint="eastAsia"/>
-        </w:rPr>
-        <w:t xml:space="preserve">   </w:t>
-      </w:r>
-      <w:r>
-        <w:rPr>
-          <w:rFonts w:hint="eastAsia"/>
-        </w:rPr>
-        <w:t>└──</w:t>
+        <w:t>│└──</w:t>
       </w:r>
       <w:r>
         <w:rPr>
@@ -655,27 +322,12 @@
     <w:p>
       <w:pPr>
         <w:spacing w:after="0" w:line="240" w:lineRule="auto"/>
-        <w:rPr>
-          <w:rFonts w:hint="eastAsia"/>
-        </w:rPr>
       </w:pPr>
       <w:r>
         <w:rPr>
           <w:rFonts w:hint="eastAsia"/>
         </w:rPr>
-        <w:t>│</w:t>
-      </w:r>
-      <w:r>
-        <w:rPr>
-          <w:rFonts w:hint="eastAsia"/>
-        </w:rPr>
-        <w:t xml:space="preserve">       </w:t>
-      </w:r>
-      <w:r>
-        <w:rPr>
-          <w:rFonts w:hint="eastAsia"/>
-        </w:rPr>
-        <w:t>├──</w:t>
+        <w:t>│├──</w:t>
       </w:r>
       <w:r>
         <w:rPr>
@@ -687,27 +339,12 @@
     <w:p>
       <w:pPr>
         <w:spacing w:after="0" w:line="240" w:lineRule="auto"/>
-        <w:rPr>
-          <w:rFonts w:hint="eastAsia"/>
-        </w:rPr>
       </w:pPr>
       <w:r>
         <w:rPr>
           <w:rFonts w:hint="eastAsia"/>
         </w:rPr>
-        <w:t>│</w:t>
-      </w:r>
-      <w:r>
-        <w:rPr>
-          <w:rFonts w:hint="eastAsia"/>
-        </w:rPr>
-        <w:t xml:space="preserve">       </w:t>
-      </w:r>
-      <w:r>
-        <w:rPr>
-          <w:rFonts w:hint="eastAsia"/>
-        </w:rPr>
-        <w:t>├──</w:t>
+        <w:t>│├──</w:t>
       </w:r>
       <w:r>
         <w:rPr>
@@ -719,27 +356,22 @@
     <w:p>
       <w:pPr>
         <w:spacing w:after="0" w:line="240" w:lineRule="auto"/>
-        <w:rPr>
-          <w:rFonts w:hint="eastAsia"/>
-        </w:rPr>
+      </w:pPr>
+    </w:p>
+    <w:p>
+      <w:pPr>
+        <w:spacing w:after="0" w:line="240" w:lineRule="auto"/>
+      </w:pPr>
+    </w:p>
+    <w:p>
+      <w:pPr>
+        <w:spacing w:after="0" w:line="240" w:lineRule="auto"/>
       </w:pPr>
       <w:r>
         <w:rPr>
           <w:rFonts w:hint="eastAsia"/>
         </w:rPr>
-        <w:t>│</w:t>
-      </w:r>
-      <w:r>
-        <w:rPr>
-          <w:rFonts w:hint="eastAsia"/>
-        </w:rPr>
-        <w:t xml:space="preserve">       </w:t>
-      </w:r>
-      <w:r>
-        <w:rPr>
-          <w:rFonts w:hint="eastAsia"/>
-        </w:rPr>
-        <w:t>└──</w:t>
+        <w:t>│└──</w:t>
       </w:r>
       <w:r>
         <w:rPr>
@@ -751,9 +383,6 @@
     <w:p>
       <w:pPr>
         <w:spacing w:after="0" w:line="240" w:lineRule="auto"/>
-        <w:rPr>
-          <w:rFonts w:hint="eastAsia"/>
-        </w:rPr>
       </w:pPr>
       <w:r>
         <w:rPr>
@@ -765,9 +394,6 @@
     <w:p>
       <w:pPr>
         <w:spacing w:after="0" w:line="240" w:lineRule="auto"/>
-        <w:rPr>
-          <w:rFonts w:hint="eastAsia"/>
-        </w:rPr>
       </w:pPr>
       <w:r>
         <w:rPr>
@@ -775,14 +401,7 @@
         </w:rPr>
         <w:t>├──</w:t>
       </w:r>
-      <w:r>
-        <w:rPr>
-          <w:rFonts w:hint="eastAsia"/>
-        </w:rPr>
-        <w:t xml:space="preserve"> </w:t>
-      </w:r>
       <w:proofErr w:type="spellStart"/>
-      <w:proofErr w:type="gramStart"/>
       <w:r>
         <w:rPr>
           <w:rFonts w:hint="eastAsia"/>
@@ -790,7 +409,6 @@
         <w:t>config.properties</w:t>
       </w:r>
       <w:proofErr w:type="spellEnd"/>
-      <w:proofErr w:type="gramEnd"/>
     </w:p>
     <w:p>
       <w:pPr>
@@ -820,8 +438,8 @@
 </file>
 
 <file path=word/numbering.xml><?xml version="1.0" encoding="utf-8"?>
-<w:numbering xmlns:wpc="http://schemas.microsoft.com/office/word/2010/wordprocessingCanvas" xmlns:cx="http://schemas.microsoft.com/office/drawing/2014/chartex" xmlns:cx1="http://schemas.microsoft.com/office/drawing/2015/9/8/chartex" xmlns:cx2="http://schemas.microsoft.com/office/drawing/2015/10/21/chartex" xmlns:cx3="http://schemas.microsoft.com/office/drawing/2016/5/9/chartex" xmlns:cx4="http://schemas.microsoft.com/office/drawing/2016/5/10/chartex" xmlns:cx5="http://schemas.microsoft.com/office/drawing/2016/5/11/chartex" xmlns:cx6="http://schemas.microsoft.com/office/drawing/2016/5/12/chartex" xmlns:cx7="http://schemas.microsoft.com/office/drawing/2016/5/13/chartex" xmlns:cx8="http://schemas.microsoft.com/office/drawing/2016/5/14/chartex" xmlns:mc="http://schemas.openxmlformats.org/markup-compatibility/2006" xmlns:aink="http://schemas.microsoft.com/office/drawing/2016/ink" xmlns:am3d="http://schemas.microsoft.com/office/drawing/2017/model3d" xmlns:o="urn:schemas-microsoft-com:office:office" xmlns:oel="http://schemas.microsoft.com/office/2019/extlst" xmlns:r="http://schemas.openxmlformats.org/officeDocument/2006/relationships" xmlns:m="http://schemas.openxmlformats.org/officeDocument/2006/math" xmlns:v="urn:schemas-microsoft-com:vml" xmlns:wp14="http://schemas.microsoft.com/office/word/2010/wordprocessingDrawing" xmlns:wp="http://schemas.openxmlformats.org/drawingml/2006/wordprocessingDrawing" xmlns:w10="urn:schemas-microsoft-com:office:word" xmlns:w="http://schemas.openxmlformats.org/wordprocessingml/2006/main" xmlns:w14="http://schemas.microsoft.com/office/word/2010/wordml" xmlns:w15="http://schemas.microsoft.com/office/word/2012/wordml" xmlns:w16cex="http://schemas.microsoft.com/office/word/2018/wordml/cex" xmlns:w16cid="http://schemas.microsoft.com/office/word/2016/wordml/cid" xmlns:w16="http://schemas.microsoft.com/office/word/2018/wordml" xmlns:w16du="http://schemas.microsoft.com/office/word/2023/wordml/word16du" xmlns:w16sdtdh="http://schemas.microsoft.com/office/word/2020/wordml/sdtdatahash" xmlns:w16sdtfl="http://schemas.microsoft.com/office/word/2024/wordml/sdtformatlock" xmlns:w16se="http://schemas.microsoft.com/office/word/2015/wordml/symex" xmlns:wpg="http://schemas.microsoft.com/office/word/2010/wordprocessingGroup" xmlns:wpi="http://schemas.microsoft.com/office/word/2010/wordprocessingInk" xmlns:wne="http://schemas.microsoft.com/office/word/2006/wordml" xmlns:wps="http://schemas.microsoft.com/office/word/2010/wordprocessingShape" mc:Ignorable="w14 w15 w16se w16cid w16 w16cex w16sdtdh w16sdtfl w16du wp14">
-  <w:abstractNum w:abstractNumId="0" w15:restartNumberingAfterBreak="0">
+<w:numbering xmlns:ve="http://schemas.openxmlformats.org/markup-compatibility/2006" xmlns:o="urn:schemas-microsoft-com:office:office" xmlns:r="http://schemas.openxmlformats.org/officeDocument/2006/relationships" xmlns:m="http://schemas.openxmlformats.org/officeDocument/2006/math" xmlns:v="urn:schemas-microsoft-com:vml" xmlns:wp="http://schemas.openxmlformats.org/drawingml/2006/wordprocessingDrawing" xmlns:w10="urn:schemas-microsoft-com:office:word" xmlns:w="http://schemas.openxmlformats.org/wordprocessingml/2006/main" xmlns:wne="http://schemas.microsoft.com/office/word/2006/wordml">
+  <w:abstractNum w:abstractNumId="0">
     <w:nsid w:val="FFFFFF7C"/>
     <w:multiLevelType w:val="singleLevel"/>
     <w:tmpl w:val="C310EC42"/>
@@ -838,7 +456,7 @@
       </w:pPr>
     </w:lvl>
   </w:abstractNum>
-  <w:abstractNum w:abstractNumId="1" w15:restartNumberingAfterBreak="0">
+  <w:abstractNum w:abstractNumId="1">
     <w:nsid w:val="FFFFFF7D"/>
     <w:multiLevelType w:val="singleLevel"/>
     <w:tmpl w:val="E4089024"/>
@@ -855,7 +473,7 @@
       </w:pPr>
     </w:lvl>
   </w:abstractNum>
-  <w:abstractNum w:abstractNumId="2" w15:restartNumberingAfterBreak="0">
+  <w:abstractNum w:abstractNumId="2">
     <w:nsid w:val="FFFFFF7E"/>
     <w:multiLevelType w:val="singleLevel"/>
     <w:tmpl w:val="FB12693A"/>
@@ -873,7 +491,7 @@
       </w:pPr>
     </w:lvl>
   </w:abstractNum>
-  <w:abstractNum w:abstractNumId="3" w15:restartNumberingAfterBreak="0">
+  <w:abstractNum w:abstractNumId="3">
     <w:nsid w:val="FFFFFF7F"/>
     <w:multiLevelType w:val="singleLevel"/>
     <w:tmpl w:val="38441652"/>
@@ -891,7 +509,7 @@
       </w:pPr>
     </w:lvl>
   </w:abstractNum>
-  <w:abstractNum w:abstractNumId="4" w15:restartNumberingAfterBreak="0">
+  <w:abstractNum w:abstractNumId="4">
     <w:nsid w:val="FFFFFF81"/>
     <w:multiLevelType w:val="singleLevel"/>
     <w:tmpl w:val="171AC3A4"/>
@@ -911,7 +529,7 @@
       </w:rPr>
     </w:lvl>
   </w:abstractNum>
-  <w:abstractNum w:abstractNumId="5" w15:restartNumberingAfterBreak="0">
+  <w:abstractNum w:abstractNumId="5">
     <w:nsid w:val="FFFFFF82"/>
     <w:multiLevelType w:val="singleLevel"/>
     <w:tmpl w:val="F3EAFDEC"/>
@@ -932,7 +550,7 @@
       </w:rPr>
     </w:lvl>
   </w:abstractNum>
-  <w:abstractNum w:abstractNumId="6" w15:restartNumberingAfterBreak="0">
+  <w:abstractNum w:abstractNumId="6">
     <w:nsid w:val="FFFFFF83"/>
     <w:multiLevelType w:val="singleLevel"/>
     <w:tmpl w:val="3D1EFFD4"/>
@@ -953,7 +571,7 @@
       </w:rPr>
     </w:lvl>
   </w:abstractNum>
-  <w:abstractNum w:abstractNumId="7" w15:restartNumberingAfterBreak="0">
+  <w:abstractNum w:abstractNumId="7">
     <w:nsid w:val="FFFFFF88"/>
     <w:multiLevelType w:val="singleLevel"/>
     <w:tmpl w:val="D0A62B40"/>
@@ -971,7 +589,7 @@
       </w:pPr>
     </w:lvl>
   </w:abstractNum>
-  <w:abstractNum w:abstractNumId="8" w15:restartNumberingAfterBreak="0">
+  <w:abstractNum w:abstractNumId="8">
     <w:nsid w:val="FFFFFF89"/>
     <w:multiLevelType w:val="singleLevel"/>
     <w:tmpl w:val="29761A62"/>
@@ -992,38 +610,38 @@
       </w:rPr>
     </w:lvl>
   </w:abstractNum>
-  <w:num w:numId="1" w16cid:durableId="2046637547">
+  <w:num w:numId="1">
     <w:abstractNumId w:val="8"/>
   </w:num>
-  <w:num w:numId="2" w16cid:durableId="1744640733">
+  <w:num w:numId="2">
     <w:abstractNumId w:val="6"/>
   </w:num>
-  <w:num w:numId="3" w16cid:durableId="2134133209">
+  <w:num w:numId="3">
     <w:abstractNumId w:val="5"/>
   </w:num>
-  <w:num w:numId="4" w16cid:durableId="794375530">
+  <w:num w:numId="4">
     <w:abstractNumId w:val="4"/>
   </w:num>
-  <w:num w:numId="5" w16cid:durableId="232741316">
+  <w:num w:numId="5">
     <w:abstractNumId w:val="7"/>
   </w:num>
-  <w:num w:numId="6" w16cid:durableId="1005938579">
+  <w:num w:numId="6">
     <w:abstractNumId w:val="3"/>
   </w:num>
-  <w:num w:numId="7" w16cid:durableId="1611814247">
+  <w:num w:numId="7">
     <w:abstractNumId w:val="2"/>
   </w:num>
-  <w:num w:numId="8" w16cid:durableId="1975595367">
+  <w:num w:numId="8">
     <w:abstractNumId w:val="1"/>
   </w:num>
-  <w:num w:numId="9" w16cid:durableId="1133711720">
+  <w:num w:numId="9">
     <w:abstractNumId w:val="0"/>
   </w:num>
 </w:numbering>
 </file>
 
 <file path=word/styles.xml><?xml version="1.0" encoding="utf-8"?>
-<w:styles xmlns:mc="http://schemas.openxmlformats.org/markup-compatibility/2006" xmlns:r="http://schemas.openxmlformats.org/officeDocument/2006/relationships" xmlns:w="http://schemas.openxmlformats.org/wordprocessingml/2006/main" xmlns:w14="http://schemas.microsoft.com/office/word/2010/wordml" xmlns:w15="http://schemas.microsoft.com/office/word/2012/wordml" xmlns:w16cex="http://schemas.microsoft.com/office/word/2018/wordml/cex" xmlns:w16cid="http://schemas.microsoft.com/office/word/2016/wordml/cid" xmlns:w16="http://schemas.microsoft.com/office/word/2018/wordml" xmlns:w16du="http://schemas.microsoft.com/office/word/2023/wordml/word16du" xmlns:w16sdtdh="http://schemas.microsoft.com/office/word/2020/wordml/sdtdatahash" xmlns:w16sdtfl="http://schemas.microsoft.com/office/word/2024/wordml/sdtformatlock" xmlns:w16se="http://schemas.microsoft.com/office/word/2015/wordml/symex" mc:Ignorable="w14 w15 w16se w16cid w16 w16cex w16sdtdh w16sdtfl w16du">
+<w:styles xmlns:r="http://schemas.openxmlformats.org/officeDocument/2006/relationships" xmlns:w="http://schemas.openxmlformats.org/wordprocessingml/2006/main">
   <w:docDefaults>
     <w:rPrDefault>
       <w:rPr>
@@ -1039,374 +657,144 @@
       </w:pPr>
     </w:pPrDefault>
   </w:docDefaults>
-  <w:latentStyles w:defLockedState="0" w:defUIPriority="99" w:defSemiHidden="0" w:defUnhideWhenUsed="0" w:defQFormat="0" w:count="376">
-    <w:lsdException w:name="Normal" w:uiPriority="0" w:qFormat="1"/>
-    <w:lsdException w:name="heading 1" w:uiPriority="9" w:qFormat="1"/>
-    <w:lsdException w:name="heading 2" w:semiHidden="1" w:uiPriority="9" w:unhideWhenUsed="1" w:qFormat="1"/>
-    <w:lsdException w:name="heading 3" w:semiHidden="1" w:uiPriority="9" w:unhideWhenUsed="1" w:qFormat="1"/>
-    <w:lsdException w:name="heading 4" w:semiHidden="1" w:uiPriority="9" w:unhideWhenUsed="1" w:qFormat="1"/>
-    <w:lsdException w:name="heading 5" w:semiHidden="1" w:uiPriority="9" w:unhideWhenUsed="1" w:qFormat="1"/>
-    <w:lsdException w:name="heading 6" w:semiHidden="1" w:uiPriority="9" w:unhideWhenUsed="1" w:qFormat="1"/>
-    <w:lsdException w:name="heading 7" w:semiHidden="1" w:uiPriority="9" w:unhideWhenUsed="1" w:qFormat="1"/>
-    <w:lsdException w:name="heading 8" w:semiHidden="1" w:uiPriority="9" w:unhideWhenUsed="1" w:qFormat="1"/>
-    <w:lsdException w:name="heading 9" w:semiHidden="1" w:uiPriority="9" w:unhideWhenUsed="1" w:qFormat="1"/>
-    <w:lsdException w:name="index 1" w:semiHidden="1" w:unhideWhenUsed="1"/>
-    <w:lsdException w:name="index 2" w:semiHidden="1" w:unhideWhenUsed="1"/>
-    <w:lsdException w:name="index 3" w:semiHidden="1" w:unhideWhenUsed="1"/>
-    <w:lsdException w:name="index 4" w:semiHidden="1" w:unhideWhenUsed="1"/>
-    <w:lsdException w:name="index 5" w:semiHidden="1" w:unhideWhenUsed="1"/>
-    <w:lsdException w:name="index 6" w:semiHidden="1" w:unhideWhenUsed="1"/>
-    <w:lsdException w:name="index 7" w:semiHidden="1" w:unhideWhenUsed="1"/>
-    <w:lsdException w:name="index 8" w:semiHidden="1" w:unhideWhenUsed="1"/>
-    <w:lsdException w:name="index 9" w:semiHidden="1" w:unhideWhenUsed="1"/>
-    <w:lsdException w:name="toc 1" w:semiHidden="1" w:uiPriority="39" w:unhideWhenUsed="1"/>
-    <w:lsdException w:name="toc 2" w:semiHidden="1" w:uiPriority="39" w:unhideWhenUsed="1"/>
-    <w:lsdException w:name="toc 3" w:semiHidden="1" w:uiPriority="39" w:unhideWhenUsed="1"/>
-    <w:lsdException w:name="toc 4" w:semiHidden="1" w:uiPriority="39" w:unhideWhenUsed="1"/>
-    <w:lsdException w:name="toc 5" w:semiHidden="1" w:uiPriority="39" w:unhideWhenUsed="1"/>
-    <w:lsdException w:name="toc 6" w:semiHidden="1" w:uiPriority="39" w:unhideWhenUsed="1"/>
-    <w:lsdException w:name="toc 7" w:semiHidden="1" w:uiPriority="39" w:unhideWhenUsed="1"/>
-    <w:lsdException w:name="toc 8" w:semiHidden="1" w:uiPriority="39" w:unhideWhenUsed="1"/>
-    <w:lsdException w:name="toc 9" w:semiHidden="1" w:uiPriority="39" w:unhideWhenUsed="1"/>
-    <w:lsdException w:name="Normal Indent" w:semiHidden="1" w:unhideWhenUsed="1"/>
-    <w:lsdException w:name="footnote text" w:semiHidden="1" w:unhideWhenUsed="1"/>
-    <w:lsdException w:name="annotation text" w:semiHidden="1" w:unhideWhenUsed="1"/>
-    <w:lsdException w:name="header" w:semiHidden="1" w:unhideWhenUsed="1"/>
-    <w:lsdException w:name="footer" w:semiHidden="1" w:unhideWhenUsed="1"/>
-    <w:lsdException w:name="index heading" w:semiHidden="1" w:unhideWhenUsed="1"/>
-    <w:lsdException w:name="caption" w:semiHidden="1" w:uiPriority="35" w:unhideWhenUsed="1" w:qFormat="1"/>
-    <w:lsdException w:name="table of figures" w:semiHidden="1" w:unhideWhenUsed="1"/>
-    <w:lsdException w:name="envelope address" w:semiHidden="1" w:unhideWhenUsed="1"/>
-    <w:lsdException w:name="envelope return" w:semiHidden="1" w:unhideWhenUsed="1"/>
-    <w:lsdException w:name="footnote reference" w:semiHidden="1" w:unhideWhenUsed="1"/>
-    <w:lsdException w:name="annotation reference" w:semiHidden="1" w:unhideWhenUsed="1"/>
-    <w:lsdException w:name="line number" w:semiHidden="1" w:unhideWhenUsed="1"/>
-    <w:lsdException w:name="page number" w:semiHidden="1" w:unhideWhenUsed="1"/>
-    <w:lsdException w:name="endnote reference" w:semiHidden="1" w:unhideWhenUsed="1"/>
-    <w:lsdException w:name="endnote text" w:semiHidden="1" w:unhideWhenUsed="1"/>
-    <w:lsdException w:name="table of authorities" w:semiHidden="1" w:unhideWhenUsed="1"/>
-    <w:lsdException w:name="macro" w:semiHidden="1" w:unhideWhenUsed="1"/>
-    <w:lsdException w:name="toa heading" w:semiHidden="1" w:unhideWhenUsed="1"/>
-    <w:lsdException w:name="List" w:semiHidden="1" w:unhideWhenUsed="1"/>
-    <w:lsdException w:name="List Bullet" w:semiHidden="1" w:unhideWhenUsed="1"/>
-    <w:lsdException w:name="List Number" w:semiHidden="1" w:unhideWhenUsed="1"/>
-    <w:lsdException w:name="List 2" w:semiHidden="1" w:unhideWhenUsed="1"/>
-    <w:lsdException w:name="List 3" w:semiHidden="1" w:unhideWhenUsed="1"/>
-    <w:lsdException w:name="List 4" w:semiHidden="1" w:unhideWhenUsed="1"/>
-    <w:lsdException w:name="List 5" w:semiHidden="1" w:unhideWhenUsed="1"/>
-    <w:lsdException w:name="List Bullet 2" w:semiHidden="1" w:unhideWhenUsed="1"/>
-    <w:lsdException w:name="List Bullet 3" w:semiHidden="1" w:unhideWhenUsed="1"/>
-    <w:lsdException w:name="List Bullet 4" w:semiHidden="1" w:unhideWhenUsed="1"/>
-    <w:lsdException w:name="List Bullet 5" w:semiHidden="1" w:unhideWhenUsed="1"/>
-    <w:lsdException w:name="List Number 2" w:semiHidden="1" w:unhideWhenUsed="1"/>
-    <w:lsdException w:name="List Number 3" w:semiHidden="1" w:unhideWhenUsed="1"/>
-    <w:lsdException w:name="List Number 4" w:semiHidden="1" w:unhideWhenUsed="1"/>
-    <w:lsdException w:name="List Number 5" w:semiHidden="1" w:unhideWhenUsed="1"/>
-    <w:lsdException w:name="Title" w:uiPriority="10" w:qFormat="1"/>
-    <w:lsdException w:name="Closing" w:semiHidden="1" w:unhideWhenUsed="1"/>
-    <w:lsdException w:name="Signature" w:semiHidden="1" w:unhideWhenUsed="1"/>
-    <w:lsdException w:name="Default Paragraph Font" w:semiHidden="1" w:uiPriority="1" w:unhideWhenUsed="1"/>
-    <w:lsdException w:name="Body Text" w:semiHidden="1" w:unhideWhenUsed="1"/>
-    <w:lsdException w:name="Body Text Indent" w:semiHidden="1" w:unhideWhenUsed="1"/>
-    <w:lsdException w:name="List Continue" w:semiHidden="1" w:unhideWhenUsed="1"/>
-    <w:lsdException w:name="List Continue 2" w:semiHidden="1" w:unhideWhenUsed="1"/>
-    <w:lsdException w:name="List Continue 3" w:semiHidden="1" w:unhideWhenUsed="1"/>
-    <w:lsdException w:name="List Continue 4" w:semiHidden="1" w:unhideWhenUsed="1"/>
-    <w:lsdException w:name="List Continue 5" w:semiHidden="1" w:unhideWhenUsed="1"/>
-    <w:lsdException w:name="Message Header" w:semiHidden="1" w:unhideWhenUsed="1"/>
-    <w:lsdException w:name="Subtitle" w:uiPriority="11" w:qFormat="1"/>
-    <w:lsdException w:name="Salutation" w:semiHidden="1" w:unhideWhenUsed="1"/>
-    <w:lsdException w:name="Date" w:semiHidden="1" w:unhideWhenUsed="1"/>
-    <w:lsdException w:name="Body Text First Indent" w:semiHidden="1" w:unhideWhenUsed="1"/>
-    <w:lsdException w:name="Body Text First Indent 2" w:semiHidden="1" w:unhideWhenUsed="1"/>
-    <w:lsdException w:name="Note Heading" w:semiHidden="1" w:unhideWhenUsed="1"/>
-    <w:lsdException w:name="Body Text 2" w:semiHidden="1" w:unhideWhenUsed="1"/>
-    <w:lsdException w:name="Body Text 3" w:semiHidden="1" w:unhideWhenUsed="1"/>
-    <w:lsdException w:name="Body Text Indent 2" w:semiHidden="1" w:unhideWhenUsed="1"/>
-    <w:lsdException w:name="Body Text Indent 3" w:semiHidden="1" w:unhideWhenUsed="1"/>
-    <w:lsdException w:name="Block Text" w:semiHidden="1" w:unhideWhenUsed="1"/>
-    <w:lsdException w:name="Hyperlink" w:semiHidden="1" w:unhideWhenUsed="1"/>
-    <w:lsdException w:name="FollowedHyperlink" w:semiHidden="1" w:unhideWhenUsed="1"/>
-    <w:lsdException w:name="Strong" w:uiPriority="22" w:qFormat="1"/>
-    <w:lsdException w:name="Emphasis" w:uiPriority="20" w:qFormat="1"/>
-    <w:lsdException w:name="Document Map" w:semiHidden="1" w:unhideWhenUsed="1"/>
-    <w:lsdException w:name="Plain Text" w:semiHidden="1" w:unhideWhenUsed="1"/>
-    <w:lsdException w:name="E-mail Signature" w:semiHidden="1" w:unhideWhenUsed="1"/>
-    <w:lsdException w:name="HTML Top of Form" w:semiHidden="1" w:unhideWhenUsed="1"/>
-    <w:lsdException w:name="HTML Bottom of Form" w:semiHidden="1" w:unhideWhenUsed="1"/>
-    <w:lsdException w:name="Normal (Web)" w:semiHidden="1" w:unhideWhenUsed="1"/>
-    <w:lsdException w:name="HTML Acronym" w:semiHidden="1" w:unhideWhenUsed="1"/>
-    <w:lsdException w:name="HTML Address" w:semiHidden="1" w:unhideWhenUsed="1"/>
-    <w:lsdException w:name="HTML Cite" w:semiHidden="1" w:unhideWhenUsed="1"/>
-    <w:lsdException w:name="HTML Code" w:semiHidden="1" w:unhideWhenUsed="1"/>
-    <w:lsdException w:name="HTML Definition" w:semiHidden="1" w:unhideWhenUsed="1"/>
-    <w:lsdException w:name="HTML Keyboard" w:semiHidden="1" w:unhideWhenUsed="1"/>
-    <w:lsdException w:name="HTML Preformatted" w:semiHidden="1" w:unhideWhenUsed="1"/>
-    <w:lsdException w:name="HTML Sample" w:semiHidden="1" w:unhideWhenUsed="1"/>
-    <w:lsdException w:name="HTML Typewriter" w:semiHidden="1" w:unhideWhenUsed="1"/>
-    <w:lsdException w:name="HTML Variable" w:semiHidden="1" w:unhideWhenUsed="1"/>
-    <w:lsdException w:name="Normal Table" w:semiHidden="1" w:unhideWhenUsed="1"/>
-    <w:lsdException w:name="annotation subject" w:semiHidden="1" w:unhideWhenUsed="1"/>
-    <w:lsdException w:name="No List" w:semiHidden="1" w:unhideWhenUsed="1"/>
-    <w:lsdException w:name="Outline List 1" w:semiHidden="1" w:unhideWhenUsed="1"/>
-    <w:lsdException w:name="Outline List 2" w:semiHidden="1" w:unhideWhenUsed="1"/>
-    <w:lsdException w:name="Outline List 3" w:semiHidden="1" w:unhideWhenUsed="1"/>
-    <w:lsdException w:name="Table Simple 1" w:semiHidden="1" w:unhideWhenUsed="1"/>
-    <w:lsdException w:name="Table Simple 2" w:semiHidden="1" w:unhideWhenUsed="1"/>
-    <w:lsdException w:name="Table Simple 3" w:semiHidden="1" w:unhideWhenUsed="1"/>
-    <w:lsdException w:name="Table Classic 1" w:semiHidden="1" w:unhideWhenUsed="1"/>
-    <w:lsdException w:name="Table Classic 2" w:semiHidden="1" w:unhideWhenUsed="1"/>
-    <w:lsdException w:name="Table Classic 3" w:semiHidden="1" w:unhideWhenUsed="1"/>
-    <w:lsdException w:name="Table Classic 4" w:semiHidden="1" w:unhideWhenUsed="1"/>
-    <w:lsdException w:name="Table Colorful 1" w:semiHidden="1" w:unhideWhenUsed="1"/>
-    <w:lsdException w:name="Table Colorful 2" w:semiHidden="1" w:unhideWhenUsed="1"/>
-    <w:lsdException w:name="Table Colorful 3" w:semiHidden="1" w:unhideWhenUsed="1"/>
-    <w:lsdException w:name="Table Columns 1" w:semiHidden="1" w:unhideWhenUsed="1"/>
-    <w:lsdException w:name="Table Columns 2" w:semiHidden="1" w:unhideWhenUsed="1"/>
-    <w:lsdException w:name="Table Columns 3" w:semiHidden="1" w:unhideWhenUsed="1"/>
-    <w:lsdException w:name="Table Columns 4" w:semiHidden="1" w:unhideWhenUsed="1"/>
-    <w:lsdException w:name="Table Columns 5" w:semiHidden="1" w:unhideWhenUsed="1"/>
-    <w:lsdException w:name="Table Grid 1" w:semiHidden="1" w:unhideWhenUsed="1"/>
-    <w:lsdException w:name="Table Grid 2" w:semiHidden="1" w:unhideWhenUsed="1"/>
-    <w:lsdException w:name="Table Grid 3" w:semiHidden="1" w:unhideWhenUsed="1"/>
-    <w:lsdException w:name="Table Grid 4" w:semiHidden="1" w:unhideWhenUsed="1"/>
-    <w:lsdException w:name="Table Grid 5" w:semiHidden="1" w:unhideWhenUsed="1"/>
-    <w:lsdException w:name="Table Grid 6" w:semiHidden="1" w:unhideWhenUsed="1"/>
-    <w:lsdException w:name="Table Grid 7" w:semiHidden="1" w:unhideWhenUsed="1"/>
-    <w:lsdException w:name="Table Grid 8" w:semiHidden="1" w:unhideWhenUsed="1"/>
-    <w:lsdException w:name="Table List 1" w:semiHidden="1" w:unhideWhenUsed="1"/>
-    <w:lsdException w:name="Table List 2" w:semiHidden="1" w:unhideWhenUsed="1"/>
-    <w:lsdException w:name="Table List 3" w:semiHidden="1" w:unhideWhenUsed="1"/>
-    <w:lsdException w:name="Table List 4" w:semiHidden="1" w:unhideWhenUsed="1"/>
-    <w:lsdException w:name="Table List 5" w:semiHidden="1" w:unhideWhenUsed="1"/>
-    <w:lsdException w:name="Table List 6" w:semiHidden="1" w:unhideWhenUsed="1"/>
-    <w:lsdException w:name="Table List 7" w:semiHidden="1" w:unhideWhenUsed="1"/>
-    <w:lsdException w:name="Table List 8" w:semiHidden="1" w:unhideWhenUsed="1"/>
-    <w:lsdException w:name="Table 3D effects 1" w:semiHidden="1" w:unhideWhenUsed="1"/>
-    <w:lsdException w:name="Table 3D effects 2" w:semiHidden="1" w:unhideWhenUsed="1"/>
-    <w:lsdException w:name="Table 3D effects 3" w:semiHidden="1" w:unhideWhenUsed="1"/>
-    <w:lsdException w:name="Table Contemporary" w:semiHidden="1" w:unhideWhenUsed="1"/>
-    <w:lsdException w:name="Table Elegant" w:semiHidden="1" w:unhideWhenUsed="1"/>
-    <w:lsdException w:name="Table Professional" w:semiHidden="1" w:unhideWhenUsed="1"/>
-    <w:lsdException w:name="Table Subtle 1" w:semiHidden="1" w:unhideWhenUsed="1"/>
-    <w:lsdException w:name="Table Subtle 2" w:semiHidden="1" w:unhideWhenUsed="1"/>
-    <w:lsdException w:name="Table Web 1" w:semiHidden="1" w:unhideWhenUsed="1"/>
-    <w:lsdException w:name="Table Web 2" w:semiHidden="1" w:unhideWhenUsed="1"/>
-    <w:lsdException w:name="Table Web 3" w:semiHidden="1" w:unhideWhenUsed="1"/>
-    <w:lsdException w:name="Balloon Text" w:semiHidden="1" w:unhideWhenUsed="1"/>
-    <w:lsdException w:name="Table Grid" w:uiPriority="59"/>
-    <w:lsdException w:name="Table Theme" w:semiHidden="1" w:unhideWhenUsed="1"/>
-    <w:lsdException w:name="Placeholder Text" w:semiHidden="1"/>
-    <w:lsdException w:name="No Spacing" w:uiPriority="1" w:qFormat="1"/>
-    <w:lsdException w:name="Light Shading" w:uiPriority="60"/>
-    <w:lsdException w:name="Light List" w:uiPriority="61"/>
-    <w:lsdException w:name="Light Grid" w:uiPriority="62"/>
-    <w:lsdException w:name="Medium Shading 1" w:uiPriority="63"/>
-    <w:lsdException w:name="Medium Shading 2" w:uiPriority="64"/>
-    <w:lsdException w:name="Medium List 1" w:uiPriority="65"/>
-    <w:lsdException w:name="Medium List 2" w:uiPriority="66"/>
-    <w:lsdException w:name="Medium Grid 1" w:uiPriority="67"/>
-    <w:lsdException w:name="Medium Grid 2" w:uiPriority="68"/>
-    <w:lsdException w:name="Medium Grid 3" w:uiPriority="69"/>
-    <w:lsdException w:name="Dark List" w:uiPriority="70"/>
-    <w:lsdException w:name="Colorful Shading" w:uiPriority="71"/>
-    <w:lsdException w:name="Colorful List" w:uiPriority="72"/>
-    <w:lsdException w:name="Colorful Grid" w:uiPriority="73"/>
-    <w:lsdException w:name="Light Shading Accent 1" w:uiPriority="60"/>
-    <w:lsdException w:name="Light List Accent 1" w:uiPriority="61"/>
-    <w:lsdException w:name="Light Grid Accent 1" w:uiPriority="62"/>
-    <w:lsdException w:name="Medium Shading 1 Accent 1" w:uiPriority="63"/>
-    <w:lsdException w:name="Medium Shading 2 Accent 1" w:uiPriority="64"/>
-    <w:lsdException w:name="Medium List 1 Accent 1" w:uiPriority="65"/>
-    <w:lsdException w:name="Revision" w:semiHidden="1"/>
-    <w:lsdException w:name="List Paragraph" w:uiPriority="34" w:qFormat="1"/>
-    <w:lsdException w:name="Quote" w:uiPriority="29" w:qFormat="1"/>
-    <w:lsdException w:name="Intense Quote" w:uiPriority="30" w:qFormat="1"/>
-    <w:lsdException w:name="Medium List 2 Accent 1" w:uiPriority="66"/>
-    <w:lsdException w:name="Medium Grid 1 Accent 1" w:uiPriority="67"/>
-    <w:lsdException w:name="Medium Grid 2 Accent 1" w:uiPriority="68"/>
-    <w:lsdException w:name="Medium Grid 3 Accent 1" w:uiPriority="69"/>
-    <w:lsdException w:name="Dark List Accent 1" w:uiPriority="70"/>
-    <w:lsdException w:name="Colorful Shading Accent 1" w:uiPriority="71"/>
-    <w:lsdException w:name="Colorful List Accent 1" w:uiPriority="72"/>
-    <w:lsdException w:name="Colorful Grid Accent 1" w:uiPriority="73"/>
-    <w:lsdException w:name="Light Shading Accent 2" w:uiPriority="60"/>
-    <w:lsdException w:name="Light List Accent 2" w:uiPriority="61"/>
-    <w:lsdException w:name="Light Grid Accent 2" w:uiPriority="62"/>
-    <w:lsdException w:name="Medium Shading 1 Accent 2" w:uiPriority="63"/>
-    <w:lsdException w:name="Medium Shading 2 Accent 2" w:uiPriority="64"/>
-    <w:lsdException w:name="Medium List 1 Accent 2" w:uiPriority="65"/>
-    <w:lsdException w:name="Medium List 2 Accent 2" w:uiPriority="66"/>
-    <w:lsdException w:name="Medium Grid 1 Accent 2" w:uiPriority="67"/>
-    <w:lsdException w:name="Medium Grid 2 Accent 2" w:uiPriority="68"/>
-    <w:lsdException w:name="Medium Grid 3 Accent 2" w:uiPriority="69"/>
-    <w:lsdException w:name="Dark List Accent 2" w:uiPriority="70"/>
-    <w:lsdException w:name="Colorful Shading Accent 2" w:uiPriority="71"/>
-    <w:lsdException w:name="Colorful List Accent 2" w:uiPriority="72"/>
-    <w:lsdException w:name="Colorful Grid Accent 2" w:uiPriority="73"/>
-    <w:lsdException w:name="Light Shading Accent 3" w:uiPriority="60"/>
-    <w:lsdException w:name="Light List Accent 3" w:uiPriority="61"/>
-    <w:lsdException w:name="Light Grid Accent 3" w:uiPriority="62"/>
-    <w:lsdException w:name="Medium Shading 1 Accent 3" w:uiPriority="63"/>
-    <w:lsdException w:name="Medium Shading 2 Accent 3" w:uiPriority="64"/>
-    <w:lsdException w:name="Medium List 1 Accent 3" w:uiPriority="65"/>
-    <w:lsdException w:name="Medium List 2 Accent 3" w:uiPriority="66"/>
-    <w:lsdException w:name="Medium Grid 1 Accent 3" w:uiPriority="67"/>
-    <w:lsdException w:name="Medium Grid 2 Accent 3" w:uiPriority="68"/>
-    <w:lsdException w:name="Medium Grid 3 Accent 3" w:uiPriority="69"/>
-    <w:lsdException w:name="Dark List Accent 3" w:uiPriority="70"/>
-    <w:lsdException w:name="Colorful Shading Accent 3" w:uiPriority="71"/>
-    <w:lsdException w:name="Colorful List Accent 3" w:uiPriority="72"/>
-    <w:lsdException w:name="Colorful Grid Accent 3" w:uiPriority="73"/>
-    <w:lsdException w:name="Light Shading Accent 4" w:uiPriority="60"/>
-    <w:lsdException w:name="Light List Accent 4" w:uiPriority="61"/>
-    <w:lsdException w:name="Light Grid Accent 4" w:uiPriority="62"/>
-    <w:lsdException w:name="Medium Shading 1 Accent 4" w:uiPriority="63"/>
-    <w:lsdException w:name="Medium Shading 2 Accent 4" w:uiPriority="64"/>
-    <w:lsdException w:name="Medium List 1 Accent 4" w:uiPriority="65"/>
-    <w:lsdException w:name="Medium List 2 Accent 4" w:uiPriority="66"/>
-    <w:lsdException w:name="Medium Grid 1 Accent 4" w:uiPriority="67"/>
-    <w:lsdException w:name="Medium Grid 2 Accent 4" w:uiPriority="68"/>
-    <w:lsdException w:name="Medium Grid 3 Accent 4" w:uiPriority="69"/>
-    <w:lsdException w:name="Dark List Accent 4" w:uiPriority="70"/>
-    <w:lsdException w:name="Colorful Shading Accent 4" w:uiPriority="71"/>
-    <w:lsdException w:name="Colorful List Accent 4" w:uiPriority="72"/>
-    <w:lsdException w:name="Colorful Grid Accent 4" w:uiPriority="73"/>
-    <w:lsdException w:name="Light Shading Accent 5" w:uiPriority="60"/>
-    <w:lsdException w:name="Light List Accent 5" w:uiPriority="61"/>
-    <w:lsdException w:name="Light Grid Accent 5" w:uiPriority="62"/>
-    <w:lsdException w:name="Medium Shading 1 Accent 5" w:uiPriority="63"/>
-    <w:lsdException w:name="Medium Shading 2 Accent 5" w:uiPriority="64"/>
-    <w:lsdException w:name="Medium List 1 Accent 5" w:uiPriority="65"/>
-    <w:lsdException w:name="Medium List 2 Accent 5" w:uiPriority="66"/>
-    <w:lsdException w:name="Medium Grid 1 Accent 5" w:uiPriority="67"/>
-    <w:lsdException w:name="Medium Grid 2 Accent 5" w:uiPriority="68"/>
-    <w:lsdException w:name="Medium Grid 3 Accent 5" w:uiPriority="69"/>
-    <w:lsdException w:name="Dark List Accent 5" w:uiPriority="70"/>
-    <w:lsdException w:name="Colorful Shading Accent 5" w:uiPriority="71"/>
-    <w:lsdException w:name="Colorful List Accent 5" w:uiPriority="72"/>
-    <w:lsdException w:name="Colorful Grid Accent 5" w:uiPriority="73"/>
-    <w:lsdException w:name="Light Shading Accent 6" w:uiPriority="60"/>
-    <w:lsdException w:name="Light List Accent 6" w:uiPriority="61"/>
-    <w:lsdException w:name="Light Grid Accent 6" w:uiPriority="62"/>
-    <w:lsdException w:name="Medium Shading 1 Accent 6" w:uiPriority="63"/>
-    <w:lsdException w:name="Medium Shading 2 Accent 6" w:uiPriority="64"/>
-    <w:lsdException w:name="Medium List 1 Accent 6" w:uiPriority="65"/>
-    <w:lsdException w:name="Medium List 2 Accent 6" w:uiPriority="66"/>
-    <w:lsdException w:name="Medium Grid 1 Accent 6" w:uiPriority="67"/>
-    <w:lsdException w:name="Medium Grid 2 Accent 6" w:uiPriority="68"/>
-    <w:lsdException w:name="Medium Grid 3 Accent 6" w:uiPriority="69"/>
-    <w:lsdException w:name="Dark List Accent 6" w:uiPriority="70"/>
-    <w:lsdException w:name="Colorful Shading Accent 6" w:uiPriority="71"/>
-    <w:lsdException w:name="Colorful List Accent 6" w:uiPriority="72"/>
-    <w:lsdException w:name="Colorful Grid Accent 6" w:uiPriority="73"/>
-    <w:lsdException w:name="Subtle Emphasis" w:uiPriority="19" w:qFormat="1"/>
-    <w:lsdException w:name="Intense Emphasis" w:uiPriority="21" w:qFormat="1"/>
-    <w:lsdException w:name="Subtle Reference" w:uiPriority="31" w:qFormat="1"/>
-    <w:lsdException w:name="Intense Reference" w:uiPriority="32" w:qFormat="1"/>
-    <w:lsdException w:name="Book Title" w:uiPriority="33" w:qFormat="1"/>
-    <w:lsdException w:name="Bibliography" w:semiHidden="1" w:uiPriority="37" w:unhideWhenUsed="1"/>
-    <w:lsdException w:name="TOC Heading" w:semiHidden="1" w:uiPriority="39" w:unhideWhenUsed="1" w:qFormat="1"/>
-    <w:lsdException w:name="Grid Table 4" w:uiPriority="49"/>
-    <w:lsdException w:name="Grid Table 5 Dark" w:uiPriority="50"/>
-    <w:lsdException w:name="Grid Table 6 Colorful" w:uiPriority="51"/>
-    <w:lsdException w:name="Grid Table 7 Colorful" w:uiPriority="52"/>
-    <w:lsdException w:name="Grid Table 1 Light Accent 1" w:uiPriority="46"/>
-    <w:lsdException w:name="Grid Table 2 Accent 1" w:uiPriority="47"/>
-    <w:lsdException w:name="Grid Table 3 Accent 1" w:uiPriority="48"/>
-    <w:lsdException w:name="Grid Table 4 Accent 1" w:uiPriority="49"/>
-    <w:lsdException w:name="Grid Table 5 Dark Accent 1" w:uiPriority="50"/>
-    <w:lsdException w:name="Grid Table 6 Colorful Accent 1" w:uiPriority="51"/>
-    <w:lsdException w:name="Grid Table 7 Colorful Accent 1" w:uiPriority="52"/>
-    <w:lsdException w:name="Grid Table 1 Light Accent 2" w:uiPriority="46"/>
-    <w:lsdException w:name="Grid Table 2 Accent 2" w:uiPriority="47"/>
-    <w:lsdException w:name="Grid Table 3 Accent 2" w:uiPriority="48"/>
-    <w:lsdException w:name="Grid Table 4 Accent 2" w:uiPriority="49"/>
-    <w:lsdException w:name="Grid Table 5 Dark Accent 2" w:uiPriority="50"/>
-    <w:lsdException w:name="Grid Table 6 Colorful Accent 2" w:uiPriority="51"/>
-    <w:lsdException w:name="Grid Table 7 Colorful Accent 2" w:uiPriority="52"/>
-    <w:lsdException w:name="Grid Table 1 Light Accent 3" w:uiPriority="46"/>
-    <w:lsdException w:name="Grid Table 2 Accent 3" w:uiPriority="47"/>
-    <w:lsdException w:name="Grid Table 3 Accent 3" w:uiPriority="48"/>
-    <w:lsdException w:name="Grid Table 4 Accent 3" w:uiPriority="49"/>
-    <w:lsdException w:name="Grid Table 5 Dark Accent 3" w:uiPriority="50"/>
-    <w:lsdException w:name="Grid Table 6 Colorful Accent 3" w:uiPriority="51"/>
-    <w:lsdException w:name="Grid Table 7 Colorful Accent 3" w:uiPriority="52"/>
-    <w:lsdException w:name="Grid Table 1 Light Accent 4" w:uiPriority="46"/>
-    <w:lsdException w:name="Grid Table 2 Accent 4" w:uiPriority="47"/>
-    <w:lsdException w:name="Grid Table 3 Accent 4" w:uiPriority="48"/>
-    <w:lsdException w:name="Grid Table 4 Accent 4" w:uiPriority="49"/>
-    <w:lsdException w:name="Grid Table 5 Dark Accent 4" w:uiPriority="50"/>
-    <w:lsdException w:name="Grid Table 6 Colorful Accent 4" w:uiPriority="51"/>
-    <w:lsdException w:name="Grid Table 7 Colorful Accent 4" w:uiPriority="52"/>
-    <w:lsdException w:name="Grid Table 1 Light Accent 5" w:uiPriority="46"/>
-    <w:lsdException w:name="Grid Table 2 Accent 5" w:uiPriority="47"/>
-    <w:lsdException w:name="Grid Table 3 Accent 5" w:uiPriority="48"/>
-    <w:lsdException w:name="Grid Table 4 Accent 5" w:uiPriority="49"/>
-    <w:lsdException w:name="Grid Table 5 Dark Accent 5" w:uiPriority="50"/>
-    <w:lsdException w:name="Grid Table 6 Colorful Accent 5" w:uiPriority="51"/>
-    <w:lsdException w:name="Grid Table 7 Colorful Accent 5" w:uiPriority="52"/>
-    <w:lsdException w:name="Grid Table 1 Light Accent 6" w:uiPriority="46"/>
-    <w:lsdException w:name="Grid Table 2 Accent 6" w:uiPriority="47"/>
-    <w:lsdException w:name="Grid Table 3 Accent 6" w:uiPriority="48"/>
-    <w:lsdException w:name="Grid Table 4 Accent 6" w:uiPriority="49"/>
-    <w:lsdException w:name="Grid Table 5 Dark Accent 6" w:uiPriority="50"/>
-    <w:lsdException w:name="Grid Table 6 Colorful Accent 6" w:uiPriority="51"/>
-    <w:lsdException w:name="Grid Table 7 Colorful Accent 6" w:uiPriority="52"/>
-    <w:lsdException w:name="List Table 1 Light" w:uiPriority="46"/>
-    <w:lsdException w:name="List Table 2" w:uiPriority="47"/>
-    <w:lsdException w:name="List Table 3" w:uiPriority="48"/>
-    <w:lsdException w:name="List Table 4" w:uiPriority="49"/>
-    <w:lsdException w:name="List Table 5 Dark" w:uiPriority="50"/>
-    <w:lsdException w:name="List Table 6 Colorful" w:uiPriority="51"/>
-    <w:lsdException w:name="List Table 7 Colorful" w:uiPriority="52"/>
-    <w:lsdException w:name="List Table 1 Light Accent 1" w:uiPriority="46"/>
-    <w:lsdException w:name="List Table 2 Accent 1" w:uiPriority="47"/>
-    <w:lsdException w:name="List Table 3 Accent 1" w:uiPriority="48"/>
-    <w:lsdException w:name="List Table 4 Accent 1" w:uiPriority="49"/>
-    <w:lsdException w:name="List Table 5 Dark Accent 1" w:uiPriority="50"/>
-    <w:lsdException w:name="List Table 6 Colorful Accent 1" w:uiPriority="51"/>
-    <w:lsdException w:name="List Table 7 Colorful Accent 1" w:uiPriority="52"/>
-    <w:lsdException w:name="List Table 1 Light Accent 2" w:uiPriority="46"/>
-    <w:lsdException w:name="List Table 2 Accent 2" w:uiPriority="47"/>
-    <w:lsdException w:name="List Table 3 Accent 2" w:uiPriority="48"/>
-    <w:lsdException w:name="List Table 4 Accent 2" w:uiPriority="49"/>
-    <w:lsdException w:name="List Table 5 Dark Accent 2" w:uiPriority="50"/>
-    <w:lsdException w:name="List Table 6 Colorful Accent 2" w:uiPriority="51"/>
-    <w:lsdException w:name="List Table 7 Colorful Accent 2" w:uiPriority="52"/>
-    <w:lsdException w:name="List Table 1 Light Accent 3" w:uiPriority="46"/>
-    <w:lsdException w:name="List Table 2 Accent 3" w:uiPriority="47"/>
-    <w:lsdException w:name="List Table 3 Accent 3" w:uiPriority="48"/>
-    <w:lsdException w:name="List Table 4 Accent 3" w:uiPriority="49"/>
-    <w:lsdException w:name="List Table 5 Dark Accent 3" w:uiPriority="50"/>
-    <w:lsdException w:name="List Table 6 Colorful Accent 3" w:uiPriority="51"/>
-    <w:lsdException w:name="List Table 7 Colorful Accent 3" w:uiPriority="52"/>
-    <w:lsdException w:name="List Table 1 Light Accent 4" w:uiPriority="46"/>
-    <w:lsdException w:name="List Table 2 Accent 4" w:uiPriority="47"/>
-    <w:lsdException w:name="List Table 3 Accent 4" w:uiPriority="48"/>
-    <w:lsdException w:name="List Table 4 Accent 4" w:uiPriority="49"/>
-    <w:lsdException w:name="List Table 5 Dark Accent 4" w:uiPriority="50"/>
-    <w:lsdException w:name="List Table 6 Colorful Accent 4" w:uiPriority="51"/>
-    <w:lsdException w:name="List Table 7 Colorful Accent 4" w:uiPriority="52"/>
-    <w:lsdException w:name="List Table 1 Light Accent 5" w:uiPriority="46"/>
-    <w:lsdException w:name="List Table 2 Accent 5" w:uiPriority="47"/>
-    <w:lsdException w:name="List Table 3 Accent 5" w:uiPriority="48"/>
-    <w:lsdException w:name="List Table 4 Accent 5" w:uiPriority="49"/>
-    <w:lsdException w:name="List Table 5 Dark Accent 5" w:uiPriority="50"/>
-    <w:lsdException w:name="List Table 6 Colorful Accent 5" w:uiPriority="51"/>
-    <w:lsdException w:name="List Table 7 Colorful Accent 5" w:uiPriority="52"/>
-    <w:lsdException w:name="List Table 1 Light Accent 6" w:uiPriority="46"/>
-    <w:lsdException w:name="List Table 2 Accent 6" w:uiPriority="47"/>
-    <w:lsdException w:name="List Table 3 Accent 6" w:uiPriority="48"/>
-    <w:lsdException w:name="List Table 4 Accent 6" w:uiPriority="49"/>
-    <w:lsdException w:name="List Table 5 Dark Accent 6" w:uiPriority="50"/>
-    <w:lsdException w:name="List Table 6 Colorful Accent 6" w:uiPriority="51"/>
-    <w:lsdException w:name="List Table 7 Colorful Accent 6" w:uiPriority="52"/>
-    <w:lsdException w:name="Mention" w:semiHidden="1" w:unhideWhenUsed="1"/>
-    <w:lsdException w:name="Smart Hyperlink" w:semiHidden="1" w:unhideWhenUsed="1"/>
-    <w:lsdException w:name="Hashtag" w:semiHidden="1" w:unhideWhenUsed="1"/>
-    <w:lsdException w:name="Unresolved Mention" w:semiHidden="1" w:unhideWhenUsed="1"/>
-    <w:lsdException w:name="Smart Link" w:semiHidden="1" w:unhideWhenUsed="1"/>
+  <w:latentStyles w:defLockedState="0" w:defUIPriority="99" w:defSemiHidden="1" w:defUnhideWhenUsed="1" w:defQFormat="0" w:count="267">
+    <w:lsdException w:name="Normal" w:semiHidden="0" w:uiPriority="0" w:unhideWhenUsed="0" w:qFormat="1"/>
+    <w:lsdException w:name="heading 1" w:semiHidden="0" w:uiPriority="9" w:unhideWhenUsed="0" w:qFormat="1"/>
+    <w:lsdException w:name="heading 2" w:uiPriority="9" w:qFormat="1"/>
+    <w:lsdException w:name="heading 3" w:uiPriority="9" w:qFormat="1"/>
+    <w:lsdException w:name="heading 4" w:uiPriority="9" w:qFormat="1"/>
+    <w:lsdException w:name="heading 5" w:uiPriority="9" w:qFormat="1"/>
+    <w:lsdException w:name="heading 6" w:uiPriority="9" w:qFormat="1"/>
+    <w:lsdException w:name="heading 7" w:uiPriority="9" w:qFormat="1"/>
+    <w:lsdException w:name="heading 8" w:uiPriority="9" w:qFormat="1"/>
+    <w:lsdException w:name="heading 9" w:uiPriority="9" w:qFormat="1"/>
+    <w:lsdException w:name="toc 1" w:uiPriority="39"/>
+    <w:lsdException w:name="toc 2" w:uiPriority="39"/>
+    <w:lsdException w:name="toc 3" w:uiPriority="39"/>
+    <w:lsdException w:name="toc 4" w:uiPriority="39"/>
+    <w:lsdException w:name="toc 5" w:uiPriority="39"/>
+    <w:lsdException w:name="toc 6" w:uiPriority="39"/>
+    <w:lsdException w:name="toc 7" w:uiPriority="39"/>
+    <w:lsdException w:name="toc 8" w:uiPriority="39"/>
+    <w:lsdException w:name="toc 9" w:uiPriority="39"/>
+    <w:lsdException w:name="caption" w:uiPriority="35" w:qFormat="1"/>
+    <w:lsdException w:name="Title" w:semiHidden="0" w:uiPriority="10" w:unhideWhenUsed="0" w:qFormat="1"/>
+    <w:lsdException w:name="Default Paragraph Font" w:uiPriority="1"/>
+    <w:lsdException w:name="Subtitle" w:semiHidden="0" w:uiPriority="11" w:unhideWhenUsed="0" w:qFormat="1"/>
+    <w:lsdException w:name="Strong" w:semiHidden="0" w:uiPriority="22" w:unhideWhenUsed="0" w:qFormat="1"/>
+    <w:lsdException w:name="Emphasis" w:semiHidden="0" w:uiPriority="20" w:unhideWhenUsed="0" w:qFormat="1"/>
+    <w:lsdException w:name="Table Grid" w:semiHidden="0" w:uiPriority="59" w:unhideWhenUsed="0"/>
+    <w:lsdException w:name="Placeholder Text" w:unhideWhenUsed="0"/>
+    <w:lsdException w:name="No Spacing" w:semiHidden="0" w:uiPriority="1" w:unhideWhenUsed="0" w:qFormat="1"/>
+    <w:lsdException w:name="Light Shading" w:semiHidden="0" w:uiPriority="60" w:unhideWhenUsed="0"/>
+    <w:lsdException w:name="Light List" w:semiHidden="0" w:uiPriority="61" w:unhideWhenUsed="0"/>
+    <w:lsdException w:name="Light Grid" w:semiHidden="0" w:uiPriority="62" w:unhideWhenUsed="0"/>
+    <w:lsdException w:name="Medium Shading 1" w:semiHidden="0" w:uiPriority="63" w:unhideWhenUsed="0"/>
+    <w:lsdException w:name="Medium Shading 2" w:semiHidden="0" w:uiPriority="64" w:unhideWhenUsed="0"/>
+    <w:lsdException w:name="Medium List 1" w:semiHidden="0" w:uiPriority="65" w:unhideWhenUsed="0"/>
+    <w:lsdException w:name="Medium List 2" w:semiHidden="0" w:uiPriority="66" w:unhideWhenUsed="0"/>
+    <w:lsdException w:name="Medium Grid 1" w:semiHidden="0" w:uiPriority="67" w:unhideWhenUsed="0"/>
+    <w:lsdException w:name="Medium Grid 2" w:semiHidden="0" w:uiPriority="68" w:unhideWhenUsed="0"/>
+    <w:lsdException w:name="Medium Grid 3" w:semiHidden="0" w:uiPriority="69" w:unhideWhenUsed="0"/>
+    <w:lsdException w:name="Dark List" w:semiHidden="0" w:uiPriority="70" w:unhideWhenUsed="0"/>
+    <w:lsdException w:name="Colorful Shading" w:semiHidden="0" w:uiPriority="71" w:unhideWhenUsed="0"/>
+    <w:lsdException w:name="Colorful List" w:semiHidden="0" w:uiPriority="72" w:unhideWhenUsed="0"/>
+    <w:lsdException w:name="Colorful Grid" w:semiHidden="0" w:uiPriority="73" w:unhideWhenUsed="0"/>
+    <w:lsdException w:name="Light Shading Accent 1" w:semiHidden="0" w:uiPriority="60" w:unhideWhenUsed="0"/>
+    <w:lsdException w:name="Light List Accent 1" w:semiHidden="0" w:uiPriority="61" w:unhideWhenUsed="0"/>
+    <w:lsdException w:name="Light Grid Accent 1" w:semiHidden="0" w:uiPriority="62" w:unhideWhenUsed="0"/>
+    <w:lsdException w:name="Medium Shading 1 Accent 1" w:semiHidden="0" w:uiPriority="63" w:unhideWhenUsed="0"/>
+    <w:lsdException w:name="Medium Shading 2 Accent 1" w:semiHidden="0" w:uiPriority="64" w:unhideWhenUsed="0"/>
+    <w:lsdException w:name="Medium List 1 Accent 1" w:semiHidden="0" w:uiPriority="65" w:unhideWhenUsed="0"/>
+    <w:lsdException w:name="Revision" w:unhideWhenUsed="0"/>
+    <w:lsdException w:name="List Paragraph" w:semiHidden="0" w:uiPriority="34" w:unhideWhenUsed="0" w:qFormat="1"/>
+    <w:lsdException w:name="Quote" w:semiHidden="0" w:uiPriority="29" w:unhideWhenUsed="0" w:qFormat="1"/>
+    <w:lsdException w:name="Intense Quote" w:semiHidden="0" w:uiPriority="30" w:unhideWhenUsed="0" w:qFormat="1"/>
+    <w:lsdException w:name="Medium List 2 Accent 1" w:semiHidden="0" w:uiPriority="66" w:unhideWhenUsed="0"/>
+    <w:lsdException w:name="Medium Grid 1 Accent 1" w:semiHidden="0" w:uiPriority="67" w:unhideWhenUsed="0"/>
+    <w:lsdException w:name="Medium Grid 2 Accent 1" w:semiHidden="0" w:uiPriority="68" w:unhideWhenUsed="0"/>
+    <w:lsdException w:name="Medium Grid 3 Accent 1" w:semiHidden="0" w:uiPriority="69" w:unhideWhenUsed="0"/>
+    <w:lsdException w:name="Dark List Accent 1" w:semiHidden="0" w:uiPriority="70" w:unhideWhenUsed="0"/>
+    <w:lsdException w:name="Colorful Shading Accent 1" w:semiHidden="0" w:uiPriority="71" w:unhideWhenUsed="0"/>
+    <w:lsdException w:name="Colorful List Accent 1" w:semiHidden="0" w:uiPriority="72" w:unhideWhenUsed="0"/>
+    <w:lsdException w:name="Colorful Grid Accent 1" w:semiHidden="0" w:uiPriority="73" w:unhideWhenUsed="0"/>
+    <w:lsdException w:name="Light Shading Accent 2" w:semiHidden="0" w:uiPriority="60" w:unhideWhenUsed="0"/>
+    <w:lsdException w:name="Light List Accent 2" w:semiHidden="0" w:uiPriority="61" w:unhideWhenUsed="0"/>
+    <w:lsdException w:name="Light Grid Accent 2" w:semiHidden="0" w:uiPriority="62" w:unhideWhenUsed="0"/>
+    <w:lsdException w:name="Medium Shading 1 Accent 2" w:semiHidden="0" w:uiPriority="63" w:unhideWhenUsed="0"/>
+    <w:lsdException w:name="Medium Shading 2 Accent 2" w:semiHidden="0" w:uiPriority="64" w:unhideWhenUsed="0"/>
+    <w:lsdException w:name="Medium List 1 Accent 2" w:semiHidden="0" w:uiPriority="65" w:unhideWhenUsed="0"/>
+    <w:lsdException w:name="Medium List 2 Accent 2" w:semiHidden="0" w:uiPriority="66" w:unhideWhenUsed="0"/>
+    <w:lsdException w:name="Medium Grid 1 Accent 2" w:semiHidden="0" w:uiPriority="67" w:unhideWhenUsed="0"/>
+    <w:lsdException w:name="Medium Grid 2 Accent 2" w:semiHidden="0" w:uiPriority="68" w:unhideWhenUsed="0"/>
+    <w:lsdException w:name="Medium Grid 3 Accent 2" w:semiHidden="0" w:uiPriority="69" w:unhideWhenUsed="0"/>
+    <w:lsdException w:name="Dark List Accent 2" w:semiHidden="0" w:uiPriority="70" w:unhideWhenUsed="0"/>
+    <w:lsdException w:name="Colorful Shading Accent 2" w:semiHidden="0" w:uiPriority="71" w:unhideWhenUsed="0"/>
+    <w:lsdException w:name="Colorful List Accent 2" w:semiHidden="0" w:uiPriority="72" w:unhideWhenUsed="0"/>
+    <w:lsdException w:name="Colorful Grid Accent 2" w:semiHidden="0" w:uiPriority="73" w:unhideWhenUsed="0"/>
+    <w:lsdException w:name="Light Shading Accent 3" w:semiHidden="0" w:uiPriority="60" w:unhideWhenUsed="0"/>
+    <w:lsdException w:name="Light List Accent 3" w:semiHidden="0" w:uiPriority="61" w:unhideWhenUsed="0"/>
+    <w:lsdException w:name="Light Grid Accent 3" w:semiHidden="0" w:uiPriority="62" w:unhideWhenUsed="0"/>
+    <w:lsdException w:name="Medium Shading 1 Accent 3" w:semiHidden="0" w:uiPriority="63" w:unhideWhenUsed="0"/>
+    <w:lsdException w:name="Medium Shading 2 Accent 3" w:semiHidden="0" w:uiPriority="64" w:unhideWhenUsed="0"/>
+    <w:lsdException w:name="Medium List 1 Accent 3" w:semiHidden="0" w:uiPriority="65" w:unhideWhenUsed="0"/>
+    <w:lsdException w:name="Medium List 2 Accent 3" w:semiHidden="0" w:uiPriority="66" w:unhideWhenUsed="0"/>
+    <w:lsdException w:name="Medium Grid 1 Accent 3" w:semiHidden="0" w:uiPriority="67" w:unhideWhenUsed="0"/>
+    <w:lsdException w:name="Medium Grid 2 Accent 3" w:semiHidden="0" w:uiPriority="68" w:unhideWhenUsed="0"/>
+    <w:lsdException w:name="Medium Grid 3 Accent 3" w:semiHidden="0" w:uiPriority="69" w:unhideWhenUsed="0"/>
+    <w:lsdException w:name="Dark List Accent 3" w:semiHidden="0" w:uiPriority="70" w:unhideWhenUsed="0"/>
+    <w:lsdException w:name="Colorful Shading Accent 3" w:semiHidden="0" w:uiPriority="71" w:unhideWhenUsed="0"/>
+    <w:lsdException w:name="Colorful List Accent 3" w:semiHidden="0" w:uiPriority="72" w:unhideWhenUsed="0"/>
+    <w:lsdException w:name="Colorful Grid Accent 3" w:semiHidden="0" w:uiPriority="73" w:unhideWhenUsed="0"/>
+    <w:lsdException w:name="Light Shading Accent 4" w:semiHidden="0" w:uiPriority="60" w:unhideWhenUsed="0"/>
+    <w:lsdException w:name="Light List Accent 4" w:semiHidden="0" w:uiPriority="61" w:unhideWhenUsed="0"/>
+    <w:lsdException w:name="Light Grid Accent 4" w:semiHidden="0" w:uiPriority="62" w:unhideWhenUsed="0"/>
+    <w:lsdException w:name="Medium Shading 1 Accent 4" w:semiHidden="0" w:uiPriority="63" w:unhideWhenUsed="0"/>
+    <w:lsdException w:name="Medium Shading 2 Accent 4" w:semiHidden="0" w:uiPriority="64" w:unhideWhenUsed="0"/>
+    <w:lsdException w:name="Medium List 1 Accent 4" w:semiHidden="0" w:uiPriority="65" w:unhideWhenUsed="0"/>
+    <w:lsdException w:name="Medium List 2 Accent 4" w:semiHidden="0" w:uiPriority="66" w:unhideWhenUsed="0"/>
+    <w:lsdException w:name="Medium Grid 1 Accent 4" w:semiHidden="0" w:uiPriority="67" w:unhideWhenUsed="0"/>
+    <w:lsdException w:name="Medium Grid 2 Accent 4" w:semiHidden="0" w:uiPriority="68" w:unhideWhenUsed="0"/>
+    <w:lsdException w:name="Medium Grid 3 Accent 4" w:semiHidden="0" w:uiPriority="69" w:unhideWhenUsed="0"/>
+    <w:lsdException w:name="Dark List Accent 4" w:semiHidden="0" w:uiPriority="70" w:unhideWhenUsed="0"/>
+    <w:lsdException w:name="Colorful Shading Accent 4" w:semiHidden="0" w:uiPriority="71" w:unhideWhenUsed="0"/>
+    <w:lsdException w:name="Colorful List Accent 4" w:semiHidden="0" w:uiPriority="72" w:unhideWhenUsed="0"/>
+    <w:lsdException w:name="Colorful Grid Accent 4" w:semiHidden="0" w:uiPriority="73" w:unhideWhenUsed="0"/>
+    <w:lsdException w:name="Light Shading Accent 5" w:semiHidden="0" w:uiPriority="60" w:unhideWhenUsed="0"/>
+    <w:lsdException w:name="Light List Accent 5" w:semiHidden="0" w:uiPriority="61" w:unhideWhenUsed="0"/>
+    <w:lsdException w:name="Light Grid Accent 5" w:semiHidden="0" w:uiPriority="62" w:unhideWhenUsed="0"/>
+    <w:lsdException w:name="Medium Shading 1 Accent 5" w:semiHidden="0" w:uiPriority="63" w:unhideWhenUsed="0"/>
+    <w:lsdException w:name="Medium Shading 2 Accent 5" w:semiHidden="0" w:uiPriority="64" w:unhideWhenUsed="0"/>
+    <w:lsdException w:name="Medium List 1 Accent 5" w:semiHidden="0" w:uiPriority="65" w:unhideWhenUsed="0"/>
+    <w:lsdException w:name="Medium List 2 Accent 5" w:semiHidden="0" w:uiPriority="66" w:unhideWhenUsed="0"/>
+    <w:lsdException w:name="Medium Grid 1 Accent 5" w:semiHidden="0" w:uiPriority="67" w:unhideWhenUsed="0"/>
+    <w:lsdException w:name="Medium Grid 2 Accent 5" w:semiHidden="0" w:uiPriority="68" w:unhideWhenUsed="0"/>
+    <w:lsdException w:name="Medium Grid 3 Accent 5" w:semiHidden="0" w:uiPriority="69" w:unhideWhenUsed="0"/>
+    <w:lsdException w:name="Dark List Accent 5" w:semiHidden="0" w:uiPriority="70" w:unhideWhenUsed="0"/>
+    <w:lsdException w:name="Colorful Shading Accent 5" w:semiHidden="0" w:uiPriority="71" w:unhideWhenUsed="0"/>
+    <w:lsdException w:name="Colorful List Accent 5" w:semiHidden="0" w:uiPriority="72" w:unhideWhenUsed="0"/>
+    <w:lsdException w:name="Colorful Grid Accent 5" w:semiHidden="0" w:uiPriority="73" w:unhideWhenUsed="0"/>
+    <w:lsdException w:name="Light Shading Accent 6" w:semiHidden="0" w:uiPriority="60" w:unhideWhenUsed="0"/>
+    <w:lsdException w:name="Light List Accent 6" w:semiHidden="0" w:uiPriority="61" w:unhideWhenUsed="0"/>
+    <w:lsdException w:name="Light Grid Accent 6" w:semiHidden="0" w:uiPriority="62" w:unhideWhenUsed="0"/>
+    <w:lsdException w:name="Medium Shading 1 Accent 6" w:semiHidden="0" w:uiPriority="63" w:unhideWhenUsed="0"/>
+    <w:lsdException w:name="Medium Shading 2 Accent 6" w:semiHidden="0" w:uiPriority="64" w:unhideWhenUsed="0"/>
+    <w:lsdException w:name="Medium List 1 Accent 6" w:semiHidden="0" w:uiPriority="65" w:unhideWhenUsed="0"/>
+    <w:lsdException w:name="Medium List 2 Accent 6" w:semiHidden="0" w:uiPriority="66" w:unhideWhenUsed="0"/>
+    <w:lsdException w:name="Medium Grid 1 Accent 6" w:semiHidden="0" w:uiPriority="67" w:unhideWhenUsed="0"/>
+    <w:lsdException w:name="Medium Grid 2 Accent 6" w:semiHidden="0" w:uiPriority="68" w:unhideWhenUsed="0"/>
+    <w:lsdException w:name="Medium Grid 3 Accent 6" w:semiHidden="0" w:uiPriority="69" w:unhideWhenUsed="0"/>
+    <w:lsdException w:name="Dark List Accent 6" w:semiHidden="0" w:uiPriority="70" w:unhideWhenUsed="0"/>
+    <w:lsdException w:name="Colorful Shading Accent 6" w:semiHidden="0" w:uiPriority="71" w:unhideWhenUsed="0"/>
+    <w:lsdException w:name="Colorful List Accent 6" w:semiHidden="0" w:uiPriority="72" w:unhideWhenUsed="0"/>
+    <w:lsdException w:name="Colorful Grid Accent 6" w:semiHidden="0" w:uiPriority="73" w:unhideWhenUsed="0"/>
+    <w:lsdException w:name="Subtle Emphasis" w:semiHidden="0" w:uiPriority="19" w:unhideWhenUsed="0" w:qFormat="1"/>
+    <w:lsdException w:name="Intense Emphasis" w:semiHidden="0" w:uiPriority="21" w:unhideWhenUsed="0" w:qFormat="1"/>
+    <w:lsdException w:name="Subtle Reference" w:semiHidden="0" w:uiPriority="31" w:unhideWhenUsed="0" w:qFormat="1"/>
+    <w:lsdException w:name="Intense Reference" w:semiHidden="0" w:uiPriority="32" w:unhideWhenUsed="0" w:qFormat="1"/>
+    <w:lsdException w:name="Book Title" w:semiHidden="0" w:uiPriority="33" w:unhideWhenUsed="0" w:qFormat="1"/>
+    <w:lsdException w:name="Bibliography" w:uiPriority="37"/>
+    <w:lsdException w:name="TOC Heading" w:uiPriority="39" w:qFormat="1"/>
   </w:latentStyles>
   <w:style w:type="paragraph" w:default="1" w:styleId="Normal">
     <w:name w:val="Normal"/>
@@ -1633,6 +1021,7 @@
     <w:uiPriority w:val="99"/>
     <w:semiHidden/>
     <w:unhideWhenUsed/>
+    <w:qFormat/>
     <w:tblPr>
       <w:tblInd w:w="0" w:type="dxa"/>
       <w:tblCellMar>
@@ -2357,6 +1746,7 @@
       <w:spacing w:after="0" w:line="240" w:lineRule="auto"/>
     </w:pPr>
     <w:tblPr>
+      <w:tblInd w:w="0" w:type="dxa"/>
       <w:tblBorders>
         <w:top w:val="single" w:sz="4" w:space="0" w:color="auto"/>
         <w:left w:val="single" w:sz="4" w:space="0" w:color="auto"/>
@@ -2365,6 +1755,12 @@
         <w:insideH w:val="single" w:sz="4" w:space="0" w:color="auto"/>
         <w:insideV w:val="single" w:sz="4" w:space="0" w:color="auto"/>
       </w:tblBorders>
+      <w:tblCellMar>
+        <w:top w:w="0" w:type="dxa"/>
+        <w:left w:w="108" w:type="dxa"/>
+        <w:bottom w:w="0" w:type="dxa"/>
+        <w:right w:w="108" w:type="dxa"/>
+      </w:tblCellMar>
     </w:tblPr>
   </w:style>
   <w:style w:type="table" w:styleId="LightShading">
@@ -2381,10 +1777,17 @@
     <w:tblPr>
       <w:tblStyleRowBandSize w:val="1"/>
       <w:tblStyleColBandSize w:val="1"/>
+      <w:tblInd w:w="0" w:type="dxa"/>
       <w:tblBorders>
         <w:top w:val="single" w:sz="8" w:space="0" w:color="000000" w:themeColor="text1"/>
         <w:bottom w:val="single" w:sz="8" w:space="0" w:color="000000" w:themeColor="text1"/>
       </w:tblBorders>
+      <w:tblCellMar>
+        <w:top w:w="0" w:type="dxa"/>
+        <w:left w:w="108" w:type="dxa"/>
+        <w:bottom w:w="0" w:type="dxa"/>
+        <w:right w:w="108" w:type="dxa"/>
+      </w:tblCellMar>
     </w:tblPr>
     <w:tblStylePr w:type="firstRow">
       <w:pPr>
@@ -2477,10 +1880,17 @@
     <w:tblPr>
       <w:tblStyleRowBandSize w:val="1"/>
       <w:tblStyleColBandSize w:val="1"/>
+      <w:tblInd w:w="0" w:type="dxa"/>
       <w:tblBorders>
         <w:top w:val="single" w:sz="8" w:space="0" w:color="4F81BD" w:themeColor="accent1"/>
         <w:bottom w:val="single" w:sz="8" w:space="0" w:color="4F81BD" w:themeColor="accent1"/>
       </w:tblBorders>
+      <w:tblCellMar>
+        <w:top w:w="0" w:type="dxa"/>
+        <w:left w:w="108" w:type="dxa"/>
+        <w:bottom w:w="0" w:type="dxa"/>
+        <w:right w:w="108" w:type="dxa"/>
+      </w:tblCellMar>
     </w:tblPr>
     <w:tblStylePr w:type="firstRow">
       <w:pPr>
@@ -2573,10 +1983,17 @@
     <w:tblPr>
       <w:tblStyleRowBandSize w:val="1"/>
       <w:tblStyleColBandSize w:val="1"/>
+      <w:tblInd w:w="0" w:type="dxa"/>
       <w:tblBorders>
         <w:top w:val="single" w:sz="8" w:space="0" w:color="C0504D" w:themeColor="accent2"/>
         <w:bottom w:val="single" w:sz="8" w:space="0" w:color="C0504D" w:themeColor="accent2"/>
       </w:tblBorders>
+      <w:tblCellMar>
+        <w:top w:w="0" w:type="dxa"/>
+        <w:left w:w="108" w:type="dxa"/>
+        <w:bottom w:w="0" w:type="dxa"/>
+        <w:right w:w="108" w:type="dxa"/>
+      </w:tblCellMar>
     </w:tblPr>
     <w:tblStylePr w:type="firstRow">
       <w:pPr>
@@ -2669,10 +2086,17 @@
     <w:tblPr>
       <w:tblStyleRowBandSize w:val="1"/>
       <w:tblStyleColBandSize w:val="1"/>
+      <w:tblInd w:w="0" w:type="dxa"/>
       <w:tblBorders>
         <w:top w:val="single" w:sz="8" w:space="0" w:color="9BBB59" w:themeColor="accent3"/>
         <w:bottom w:val="single" w:sz="8" w:space="0" w:color="9BBB59" w:themeColor="accent3"/>
       </w:tblBorders>
+      <w:tblCellMar>
+        <w:top w:w="0" w:type="dxa"/>
+        <w:left w:w="108" w:type="dxa"/>
+        <w:bottom w:w="0" w:type="dxa"/>
+        <w:right w:w="108" w:type="dxa"/>
+      </w:tblCellMar>
     </w:tblPr>
     <w:tblStylePr w:type="firstRow">
       <w:pPr>
@@ -2765,10 +2189,17 @@
     <w:tblPr>
       <w:tblStyleRowBandSize w:val="1"/>
       <w:tblStyleColBandSize w:val="1"/>
+      <w:tblInd w:w="0" w:type="dxa"/>
       <w:tblBorders>
         <w:top w:val="single" w:sz="8" w:space="0" w:color="8064A2" w:themeColor="accent4"/>
         <w:bottom w:val="single" w:sz="8" w:space="0" w:color="8064A2" w:themeColor="accent4"/>
       </w:tblBorders>
+      <w:tblCellMar>
+        <w:top w:w="0" w:type="dxa"/>
+        <w:left w:w="108" w:type="dxa"/>
+        <w:bottom w:w="0" w:type="dxa"/>
+        <w:right w:w="108" w:type="dxa"/>
+      </w:tblCellMar>
     </w:tblPr>
     <w:tblStylePr w:type="firstRow">
       <w:pPr>
@@ -2861,10 +2292,17 @@
     <w:tblPr>
       <w:tblStyleRowBandSize w:val="1"/>
       <w:tblStyleColBandSize w:val="1"/>
+      <w:tblInd w:w="0" w:type="dxa"/>
       <w:tblBorders>
         <w:top w:val="single" w:sz="8" w:space="0" w:color="4BACC6" w:themeColor="accent5"/>
         <w:bottom w:val="single" w:sz="8" w:space="0" w:color="4BACC6" w:themeColor="accent5"/>
       </w:tblBorders>
+      <w:tblCellMar>
+        <w:top w:w="0" w:type="dxa"/>
+        <w:left w:w="108" w:type="dxa"/>
+        <w:bottom w:w="0" w:type="dxa"/>
+        <w:right w:w="108" w:type="dxa"/>
+      </w:tblCellMar>
     </w:tblPr>
     <w:tblStylePr w:type="firstRow">
       <w:pPr>
@@ -2957,10 +2395,17 @@
     <w:tblPr>
       <w:tblStyleRowBandSize w:val="1"/>
       <w:tblStyleColBandSize w:val="1"/>
+      <w:tblInd w:w="0" w:type="dxa"/>
       <w:tblBorders>
         <w:top w:val="single" w:sz="8" w:space="0" w:color="F79646" w:themeColor="accent6"/>
         <w:bottom w:val="single" w:sz="8" w:space="0" w:color="F79646" w:themeColor="accent6"/>
       </w:tblBorders>
+      <w:tblCellMar>
+        <w:top w:w="0" w:type="dxa"/>
+        <w:left w:w="108" w:type="dxa"/>
+        <w:bottom w:w="0" w:type="dxa"/>
+        <w:right w:w="108" w:type="dxa"/>
+      </w:tblCellMar>
     </w:tblPr>
     <w:tblStylePr w:type="firstRow">
       <w:pPr>
@@ -3050,12 +2495,19 @@
     <w:tblPr>
       <w:tblStyleRowBandSize w:val="1"/>
       <w:tblStyleColBandSize w:val="1"/>
+      <w:tblInd w:w="0" w:type="dxa"/>
       <w:tblBorders>
         <w:top w:val="single" w:sz="8" w:space="0" w:color="000000" w:themeColor="text1"/>
         <w:left w:val="single" w:sz="8" w:space="0" w:color="000000" w:themeColor="text1"/>
         <w:bottom w:val="single" w:sz="8" w:space="0" w:color="000000" w:themeColor="text1"/>
         <w:right w:val="single" w:sz="8" w:space="0" w:color="000000" w:themeColor="text1"/>
       </w:tblBorders>
+      <w:tblCellMar>
+        <w:top w:w="0" w:type="dxa"/>
+        <w:left w:w="108" w:type="dxa"/>
+        <w:bottom w:w="0" w:type="dxa"/>
+        <w:right w:w="108" w:type="dxa"/>
+      </w:tblCellMar>
     </w:tblPr>
     <w:tblStylePr w:type="firstRow">
       <w:pPr>
@@ -3135,12 +2587,19 @@
     <w:tblPr>
       <w:tblStyleRowBandSize w:val="1"/>
       <w:tblStyleColBandSize w:val="1"/>
+      <w:tblInd w:w="0" w:type="dxa"/>
       <w:tblBorders>
         <w:top w:val="single" w:sz="8" w:space="0" w:color="4F81BD" w:themeColor="accent1"/>
         <w:left w:val="single" w:sz="8" w:space="0" w:color="4F81BD" w:themeColor="accent1"/>
         <w:bottom w:val="single" w:sz="8" w:space="0" w:color="4F81BD" w:themeColor="accent1"/>
         <w:right w:val="single" w:sz="8" w:space="0" w:color="4F81BD" w:themeColor="accent1"/>
       </w:tblBorders>
+      <w:tblCellMar>
+        <w:top w:w="0" w:type="dxa"/>
+        <w:left w:w="108" w:type="dxa"/>
+        <w:bottom w:w="0" w:type="dxa"/>
+        <w:right w:w="108" w:type="dxa"/>
+      </w:tblCellMar>
     </w:tblPr>
     <w:tblStylePr w:type="firstRow">
       <w:pPr>
@@ -3220,12 +2679,19 @@
     <w:tblPr>
       <w:tblStyleRowBandSize w:val="1"/>
       <w:tblStyleColBandSize w:val="1"/>
+      <w:tblInd w:w="0" w:type="dxa"/>
       <w:tblBorders>
         <w:top w:val="single" w:sz="8" w:space="0" w:color="C0504D" w:themeColor="accent2"/>
         <w:left w:val="single" w:sz="8" w:space="0" w:color="C0504D" w:themeColor="accent2"/>
         <w:bottom w:val="single" w:sz="8" w:space="0" w:color="C0504D" w:themeColor="accent2"/>
         <w:right w:val="single" w:sz="8" w:space="0" w:color="C0504D" w:themeColor="accent2"/>
       </w:tblBorders>
+      <w:tblCellMar>
+        <w:top w:w="0" w:type="dxa"/>
+        <w:left w:w="108" w:type="dxa"/>
+        <w:bottom w:w="0" w:type="dxa"/>
+        <w:right w:w="108" w:type="dxa"/>
+      </w:tblCellMar>
     </w:tblPr>
     <w:tblStylePr w:type="firstRow">
       <w:pPr>
@@ -3305,12 +2771,19 @@
     <w:tblPr>
       <w:tblStyleRowBandSize w:val="1"/>
       <w:tblStyleColBandSize w:val="1"/>
+      <w:tblInd w:w="0" w:type="dxa"/>
       <w:tblBorders>
         <w:top w:val="single" w:sz="8" w:space="0" w:color="9BBB59" w:themeColor="accent3"/>
         <w:left w:val="single" w:sz="8" w:space="0" w:color="9BBB59" w:themeColor="accent3"/>
         <w:bottom w:val="single" w:sz="8" w:space="0" w:color="9BBB59" w:themeColor="accent3"/>
         <w:right w:val="single" w:sz="8" w:space="0" w:color="9BBB59" w:themeColor="accent3"/>
       </w:tblBorders>
+      <w:tblCellMar>
+        <w:top w:w="0" w:type="dxa"/>
+        <w:left w:w="108" w:type="dxa"/>
+        <w:bottom w:w="0" w:type="dxa"/>
+        <w:right w:w="108" w:type="dxa"/>
+      </w:tblCellMar>
     </w:tblPr>
     <w:tblStylePr w:type="firstRow">
       <w:pPr>
@@ -3390,12 +2863,19 @@
     <w:tblPr>
       <w:tblStyleRowBandSize w:val="1"/>
       <w:tblStyleColBandSize w:val="1"/>
+      <w:tblInd w:w="0" w:type="dxa"/>
       <w:tblBorders>
         <w:top w:val="single" w:sz="8" w:space="0" w:color="8064A2" w:themeColor="accent4"/>
         <w:left w:val="single" w:sz="8" w:space="0" w:color="8064A2" w:themeColor="accent4"/>
         <w:bottom w:val="single" w:sz="8" w:space="0" w:color="8064A2" w:themeColor="accent4"/>
         <w:right w:val="single" w:sz="8" w:space="0" w:color="8064A2" w:themeColor="accent4"/>
       </w:tblBorders>
+      <w:tblCellMar>
+        <w:top w:w="0" w:type="dxa"/>
+        <w:left w:w="108" w:type="dxa"/>
+        <w:bottom w:w="0" w:type="dxa"/>
+        <w:right w:w="108" w:type="dxa"/>
+      </w:tblCellMar>
     </w:tblPr>
     <w:tblStylePr w:type="firstRow">
       <w:pPr>
@@ -3475,12 +2955,19 @@
     <w:tblPr>
       <w:tblStyleRowBandSize w:val="1"/>
       <w:tblStyleColBandSize w:val="1"/>
+      <w:tblInd w:w="0" w:type="dxa"/>
       <w:tblBorders>
         <w:top w:val="single" w:sz="8" w:space="0" w:color="4BACC6" w:themeColor="accent5"/>
         <w:left w:val="single" w:sz="8" w:space="0" w:color="4BACC6" w:themeColor="accent5"/>
         <w:bottom w:val="single" w:sz="8" w:space="0" w:color="4BACC6" w:themeColor="accent5"/>
         <w:right w:val="single" w:sz="8" w:space="0" w:color="4BACC6" w:themeColor="accent5"/>
       </w:tblBorders>
+      <w:tblCellMar>
+        <w:top w:w="0" w:type="dxa"/>
+        <w:left w:w="108" w:type="dxa"/>
+        <w:bottom w:w="0" w:type="dxa"/>
+        <w:right w:w="108" w:type="dxa"/>
+      </w:tblCellMar>
     </w:tblPr>
     <w:tblStylePr w:type="firstRow">
       <w:pPr>
@@ -3560,12 +3047,19 @@
     <w:tblPr>
       <w:tblStyleRowBandSize w:val="1"/>
       <w:tblStyleColBandSize w:val="1"/>
+      <w:tblInd w:w="0" w:type="dxa"/>
       <w:tblBorders>
         <w:top w:val="single" w:sz="8" w:space="0" w:color="F79646" w:themeColor="accent6"/>
         <w:left w:val="single" w:sz="8" w:space="0" w:color="F79646" w:themeColor="accent6"/>
         <w:bottom w:val="single" w:sz="8" w:space="0" w:color="F79646" w:themeColor="accent6"/>
         <w:right w:val="single" w:sz="8" w:space="0" w:color="F79646" w:themeColor="accent6"/>
       </w:tblBorders>
+      <w:tblCellMar>
+        <w:top w:w="0" w:type="dxa"/>
+        <w:left w:w="108" w:type="dxa"/>
+        <w:bottom w:w="0" w:type="dxa"/>
+        <w:right w:w="108" w:type="dxa"/>
+      </w:tblCellMar>
     </w:tblPr>
     <w:tblStylePr w:type="firstRow">
       <w:pPr>
@@ -3645,6 +3139,7 @@
     <w:tblPr>
       <w:tblStyleRowBandSize w:val="1"/>
       <w:tblStyleColBandSize w:val="1"/>
+      <w:tblInd w:w="0" w:type="dxa"/>
       <w:tblBorders>
         <w:top w:val="single" w:sz="8" w:space="0" w:color="000000" w:themeColor="text1"/>
         <w:left w:val="single" w:sz="8" w:space="0" w:color="000000" w:themeColor="text1"/>
@@ -3653,6 +3148,12 @@
         <w:insideH w:val="single" w:sz="8" w:space="0" w:color="000000" w:themeColor="text1"/>
         <w:insideV w:val="single" w:sz="8" w:space="0" w:color="000000" w:themeColor="text1"/>
       </w:tblBorders>
+      <w:tblCellMar>
+        <w:top w:w="0" w:type="dxa"/>
+        <w:left w:w="108" w:type="dxa"/>
+        <w:bottom w:w="0" w:type="dxa"/>
+        <w:right w:w="108" w:type="dxa"/>
+      </w:tblCellMar>
     </w:tblPr>
     <w:tblStylePr w:type="firstRow">
       <w:pPr>
@@ -3768,6 +3269,7 @@
     <w:tblPr>
       <w:tblStyleRowBandSize w:val="1"/>
       <w:tblStyleColBandSize w:val="1"/>
+      <w:tblInd w:w="0" w:type="dxa"/>
       <w:tblBorders>
         <w:top w:val="single" w:sz="8" w:space="0" w:color="4F81BD" w:themeColor="accent1"/>
         <w:left w:val="single" w:sz="8" w:space="0" w:color="4F81BD" w:themeColor="accent1"/>
@@ -3776,6 +3278,12 @@
         <w:insideH w:val="single" w:sz="8" w:space="0" w:color="4F81BD" w:themeColor="accent1"/>
         <w:insideV w:val="single" w:sz="8" w:space="0" w:color="4F81BD" w:themeColor="accent1"/>
       </w:tblBorders>
+      <w:tblCellMar>
+        <w:top w:w="0" w:type="dxa"/>
+        <w:left w:w="108" w:type="dxa"/>
+        <w:bottom w:w="0" w:type="dxa"/>
+        <w:right w:w="108" w:type="dxa"/>
+      </w:tblCellMar>
     </w:tblPr>
     <w:tblStylePr w:type="firstRow">
       <w:pPr>
@@ -3891,6 +3399,7 @@
     <w:tblPr>
       <w:tblStyleRowBandSize w:val="1"/>
       <w:tblStyleColBandSize w:val="1"/>
+      <w:tblInd w:w="0" w:type="dxa"/>
       <w:tblBorders>
         <w:top w:val="single" w:sz="8" w:space="0" w:color="C0504D" w:themeColor="accent2"/>
         <w:left w:val="single" w:sz="8" w:space="0" w:color="C0504D" w:themeColor="accent2"/>
@@ -3899,6 +3408,12 @@
         <w:insideH w:val="single" w:sz="8" w:space="0" w:color="C0504D" w:themeColor="accent2"/>
         <w:insideV w:val="single" w:sz="8" w:space="0" w:color="C0504D" w:themeColor="accent2"/>
       </w:tblBorders>
+      <w:tblCellMar>
+        <w:top w:w="0" w:type="dxa"/>
+        <w:left w:w="108" w:type="dxa"/>
+        <w:bottom w:w="0" w:type="dxa"/>
+        <w:right w:w="108" w:type="dxa"/>
+      </w:tblCellMar>
     </w:tblPr>
     <w:tblStylePr w:type="firstRow">
       <w:pPr>
@@ -4014,6 +3529,7 @@
     <w:tblPr>
       <w:tblStyleRowBandSize w:val="1"/>
       <w:tblStyleColBandSize w:val="1"/>
+      <w:tblInd w:w="0" w:type="dxa"/>
       <w:tblBorders>
         <w:top w:val="single" w:sz="8" w:space="0" w:color="9BBB59" w:themeColor="accent3"/>
         <w:left w:val="single" w:sz="8" w:space="0" w:color="9BBB59" w:themeColor="accent3"/>
@@ -4022,6 +3538,12 @@
         <w:insideH w:val="single" w:sz="8" w:space="0" w:color="9BBB59" w:themeColor="accent3"/>
         <w:insideV w:val="single" w:sz="8" w:space="0" w:color="9BBB59" w:themeColor="accent3"/>
       </w:tblBorders>
+      <w:tblCellMar>
+        <w:top w:w="0" w:type="dxa"/>
+        <w:left w:w="108" w:type="dxa"/>
+        <w:bottom w:w="0" w:type="dxa"/>
+        <w:right w:w="108" w:type="dxa"/>
+      </w:tblCellMar>
     </w:tblPr>
     <w:tblStylePr w:type="firstRow">
       <w:pPr>
@@ -4137,6 +3659,7 @@
     <w:tblPr>
       <w:tblStyleRowBandSize w:val="1"/>
       <w:tblStyleColBandSize w:val="1"/>
+      <w:tblInd w:w="0" w:type="dxa"/>
       <w:tblBorders>
         <w:top w:val="single" w:sz="8" w:space="0" w:color="8064A2" w:themeColor="accent4"/>
         <w:left w:val="single" w:sz="8" w:space="0" w:color="8064A2" w:themeColor="accent4"/>
@@ -4145,6 +3668,12 @@
         <w:insideH w:val="single" w:sz="8" w:space="0" w:color="8064A2" w:themeColor="accent4"/>
         <w:insideV w:val="single" w:sz="8" w:space="0" w:color="8064A2" w:themeColor="accent4"/>
       </w:tblBorders>
+      <w:tblCellMar>
+        <w:top w:w="0" w:type="dxa"/>
+        <w:left w:w="108" w:type="dxa"/>
+        <w:bottom w:w="0" w:type="dxa"/>
+        <w:right w:w="108" w:type="dxa"/>
+      </w:tblCellMar>
     </w:tblPr>
     <w:tblStylePr w:type="firstRow">
       <w:pPr>
@@ -4260,6 +3789,7 @@
     <w:tblPr>
       <w:tblStyleRowBandSize w:val="1"/>
       <w:tblStyleColBandSize w:val="1"/>
+      <w:tblInd w:w="0" w:type="dxa"/>
       <w:tblBorders>
         <w:top w:val="single" w:sz="8" w:space="0" w:color="4BACC6" w:themeColor="accent5"/>
         <w:left w:val="single" w:sz="8" w:space="0" w:color="4BACC6" w:themeColor="accent5"/>
@@ -4268,6 +3798,12 @@
         <w:insideH w:val="single" w:sz="8" w:space="0" w:color="4BACC6" w:themeColor="accent5"/>
         <w:insideV w:val="single" w:sz="8" w:space="0" w:color="4BACC6" w:themeColor="accent5"/>
       </w:tblBorders>
+      <w:tblCellMar>
+        <w:top w:w="0" w:type="dxa"/>
+        <w:left w:w="108" w:type="dxa"/>
+        <w:bottom w:w="0" w:type="dxa"/>
+        <w:right w:w="108" w:type="dxa"/>
+      </w:tblCellMar>
     </w:tblPr>
     <w:tblStylePr w:type="firstRow">
       <w:pPr>
@@ -4383,6 +3919,7 @@
     <w:tblPr>
       <w:tblStyleRowBandSize w:val="1"/>
       <w:tblStyleColBandSize w:val="1"/>
+      <w:tblInd w:w="0" w:type="dxa"/>
       <w:tblBorders>
         <w:top w:val="single" w:sz="8" w:space="0" w:color="F79646" w:themeColor="accent6"/>
         <w:left w:val="single" w:sz="8" w:space="0" w:color="F79646" w:themeColor="accent6"/>
@@ -4391,6 +3928,12 @@
         <w:insideH w:val="single" w:sz="8" w:space="0" w:color="F79646" w:themeColor="accent6"/>
         <w:insideV w:val="single" w:sz="8" w:space="0" w:color="F79646" w:themeColor="accent6"/>
       </w:tblBorders>
+      <w:tblCellMar>
+        <w:top w:w="0" w:type="dxa"/>
+        <w:left w:w="108" w:type="dxa"/>
+        <w:bottom w:w="0" w:type="dxa"/>
+        <w:right w:w="108" w:type="dxa"/>
+      </w:tblCellMar>
     </w:tblPr>
     <w:tblStylePr w:type="firstRow">
       <w:pPr>
@@ -4506,6 +4049,7 @@
     <w:tblPr>
       <w:tblStyleRowBandSize w:val="1"/>
       <w:tblStyleColBandSize w:val="1"/>
+      <w:tblInd w:w="0" w:type="dxa"/>
       <w:tblBorders>
         <w:top w:val="single" w:sz="8" w:space="0" w:color="404040" w:themeColor="text1" w:themeTint="BF"/>
         <w:left w:val="single" w:sz="8" w:space="0" w:color="404040" w:themeColor="text1" w:themeTint="BF"/>
@@ -4513,6 +4057,12 @@
         <w:right w:val="single" w:sz="8" w:space="0" w:color="404040" w:themeColor="text1" w:themeTint="BF"/>
         <w:insideH w:val="single" w:sz="8" w:space="0" w:color="404040" w:themeColor="text1" w:themeTint="BF"/>
       </w:tblBorders>
+      <w:tblCellMar>
+        <w:top w:w="0" w:type="dxa"/>
+        <w:left w:w="108" w:type="dxa"/>
+        <w:bottom w:w="0" w:type="dxa"/>
+        <w:right w:w="108" w:type="dxa"/>
+      </w:tblCellMar>
     </w:tblPr>
     <w:tblStylePr w:type="firstRow">
       <w:pPr>
@@ -4605,6 +4155,7 @@
     <w:tblPr>
       <w:tblStyleRowBandSize w:val="1"/>
       <w:tblStyleColBandSize w:val="1"/>
+      <w:tblInd w:w="0" w:type="dxa"/>
       <w:tblBorders>
         <w:top w:val="single" w:sz="8" w:space="0" w:color="7BA0CD" w:themeColor="accent1" w:themeTint="BF"/>
         <w:left w:val="single" w:sz="8" w:space="0" w:color="7BA0CD" w:themeColor="accent1" w:themeTint="BF"/>
@@ -4612,6 +4163,12 @@
         <w:right w:val="single" w:sz="8" w:space="0" w:color="7BA0CD" w:themeColor="accent1" w:themeTint="BF"/>
         <w:insideH w:val="single" w:sz="8" w:space="0" w:color="7BA0CD" w:themeColor="accent1" w:themeTint="BF"/>
       </w:tblBorders>
+      <w:tblCellMar>
+        <w:top w:w="0" w:type="dxa"/>
+        <w:left w:w="108" w:type="dxa"/>
+        <w:bottom w:w="0" w:type="dxa"/>
+        <w:right w:w="108" w:type="dxa"/>
+      </w:tblCellMar>
     </w:tblPr>
     <w:tblStylePr w:type="firstRow">
       <w:pPr>
@@ -4704,6 +4261,7 @@
     <w:tblPr>
       <w:tblStyleRowBandSize w:val="1"/>
       <w:tblStyleColBandSize w:val="1"/>
+      <w:tblInd w:w="0" w:type="dxa"/>
       <w:tblBorders>
         <w:top w:val="single" w:sz="8" w:space="0" w:color="CF7B79" w:themeColor="accent2" w:themeTint="BF"/>
         <w:left w:val="single" w:sz="8" w:space="0" w:color="CF7B79" w:themeColor="accent2" w:themeTint="BF"/>
@@ -4711,6 +4269,12 @@
         <w:right w:val="single" w:sz="8" w:space="0" w:color="CF7B79" w:themeColor="accent2" w:themeTint="BF"/>
         <w:insideH w:val="single" w:sz="8" w:space="0" w:color="CF7B79" w:themeColor="accent2" w:themeTint="BF"/>
       </w:tblBorders>
+      <w:tblCellMar>
+        <w:top w:w="0" w:type="dxa"/>
+        <w:left w:w="108" w:type="dxa"/>
+        <w:bottom w:w="0" w:type="dxa"/>
+        <w:right w:w="108" w:type="dxa"/>
+      </w:tblCellMar>
     </w:tblPr>
     <w:tblStylePr w:type="firstRow">
       <w:pPr>
@@ -4803,6 +4367,7 @@
     <w:tblPr>
       <w:tblStyleRowBandSize w:val="1"/>
       <w:tblStyleColBandSize w:val="1"/>
+      <w:tblInd w:w="0" w:type="dxa"/>
       <w:tblBorders>
         <w:top w:val="single" w:sz="8" w:space="0" w:color="B3CC82" w:themeColor="accent3" w:themeTint="BF"/>
         <w:left w:val="single" w:sz="8" w:space="0" w:color="B3CC82" w:themeColor="accent3" w:themeTint="BF"/>
@@ -4810,6 +4375,12 @@
         <w:right w:val="single" w:sz="8" w:space="0" w:color="B3CC82" w:themeColor="accent3" w:themeTint="BF"/>
         <w:insideH w:val="single" w:sz="8" w:space="0" w:color="B3CC82" w:themeColor="accent3" w:themeTint="BF"/>
       </w:tblBorders>
+      <w:tblCellMar>
+        <w:top w:w="0" w:type="dxa"/>
+        <w:left w:w="108" w:type="dxa"/>
+        <w:bottom w:w="0" w:type="dxa"/>
+        <w:right w:w="108" w:type="dxa"/>
+      </w:tblCellMar>
     </w:tblPr>
     <w:tblStylePr w:type="firstRow">
       <w:pPr>
@@ -4902,6 +4473,7 @@
     <w:tblPr>
       <w:tblStyleRowBandSize w:val="1"/>
       <w:tblStyleColBandSize w:val="1"/>
+      <w:tblInd w:w="0" w:type="dxa"/>
       <w:tblBorders>
         <w:top w:val="single" w:sz="8" w:space="0" w:color="9F8AB9" w:themeColor="accent4" w:themeTint="BF"/>
         <w:left w:val="single" w:sz="8" w:space="0" w:color="9F8AB9" w:themeColor="accent4" w:themeTint="BF"/>
@@ -4909,6 +4481,12 @@
         <w:right w:val="single" w:sz="8" w:space="0" w:color="9F8AB9" w:themeColor="accent4" w:themeTint="BF"/>
         <w:insideH w:val="single" w:sz="8" w:space="0" w:color="9F8AB9" w:themeColor="accent4" w:themeTint="BF"/>
       </w:tblBorders>
+      <w:tblCellMar>
+        <w:top w:w="0" w:type="dxa"/>
+        <w:left w:w="108" w:type="dxa"/>
+        <w:bottom w:w="0" w:type="dxa"/>
+        <w:right w:w="108" w:type="dxa"/>
+      </w:tblCellMar>
     </w:tblPr>
     <w:tblStylePr w:type="firstRow">
       <w:pPr>
@@ -5001,6 +4579,7 @@
     <w:tblPr>
       <w:tblStyleRowBandSize w:val="1"/>
       <w:tblStyleColBandSize w:val="1"/>
+      <w:tblInd w:w="0" w:type="dxa"/>
       <w:tblBorders>
         <w:top w:val="single" w:sz="8" w:space="0" w:color="78C0D4" w:themeColor="accent5" w:themeTint="BF"/>
         <w:left w:val="single" w:sz="8" w:space="0" w:color="78C0D4" w:themeColor="accent5" w:themeTint="BF"/>
@@ -5008,6 +4587,12 @@
         <w:right w:val="single" w:sz="8" w:space="0" w:color="78C0D4" w:themeColor="accent5" w:themeTint="BF"/>
         <w:insideH w:val="single" w:sz="8" w:space="0" w:color="78C0D4" w:themeColor="accent5" w:themeTint="BF"/>
       </w:tblBorders>
+      <w:tblCellMar>
+        <w:top w:w="0" w:type="dxa"/>
+        <w:left w:w="108" w:type="dxa"/>
+        <w:bottom w:w="0" w:type="dxa"/>
+        <w:right w:w="108" w:type="dxa"/>
+      </w:tblCellMar>
     </w:tblPr>
     <w:tblStylePr w:type="firstRow">
       <w:pPr>
@@ -5100,6 +4685,7 @@
     <w:tblPr>
       <w:tblStyleRowBandSize w:val="1"/>
       <w:tblStyleColBandSize w:val="1"/>
+      <w:tblInd w:w="0" w:type="dxa"/>
       <w:tblBorders>
         <w:top w:val="single" w:sz="8" w:space="0" w:color="F9B074" w:themeColor="accent6" w:themeTint="BF"/>
         <w:left w:val="single" w:sz="8" w:space="0" w:color="F9B074" w:themeColor="accent6" w:themeTint="BF"/>
@@ -5107,6 +4693,12 @@
         <w:right w:val="single" w:sz="8" w:space="0" w:color="F9B074" w:themeColor="accent6" w:themeTint="BF"/>
         <w:insideH w:val="single" w:sz="8" w:space="0" w:color="F9B074" w:themeColor="accent6" w:themeTint="BF"/>
       </w:tblBorders>
+      <w:tblCellMar>
+        <w:top w:w="0" w:type="dxa"/>
+        <w:left w:w="108" w:type="dxa"/>
+        <w:bottom w:w="0" w:type="dxa"/>
+        <w:right w:w="108" w:type="dxa"/>
+      </w:tblCellMar>
     </w:tblPr>
     <w:tblStylePr w:type="firstRow">
       <w:pPr>
@@ -5199,10 +4791,17 @@
     <w:tblPr>
       <w:tblStyleRowBandSize w:val="1"/>
       <w:tblStyleColBandSize w:val="1"/>
+      <w:tblInd w:w="0" w:type="dxa"/>
       <w:tblBorders>
         <w:top w:val="single" w:sz="18" w:space="0" w:color="auto"/>
         <w:bottom w:val="single" w:sz="18" w:space="0" w:color="auto"/>
       </w:tblBorders>
+      <w:tblCellMar>
+        <w:top w:w="0" w:type="dxa"/>
+        <w:left w:w="108" w:type="dxa"/>
+        <w:bottom w:w="0" w:type="dxa"/>
+        <w:right w:w="108" w:type="dxa"/>
+      </w:tblCellMar>
     </w:tblPr>
     <w:tblStylePr w:type="firstRow">
       <w:pPr>
@@ -5341,10 +4940,17 @@
     <w:tblPr>
       <w:tblStyleRowBandSize w:val="1"/>
       <w:tblStyleColBandSize w:val="1"/>
+      <w:tblInd w:w="0" w:type="dxa"/>
       <w:tblBorders>
         <w:top w:val="single" w:sz="18" w:space="0" w:color="auto"/>
         <w:bottom w:val="single" w:sz="18" w:space="0" w:color="auto"/>
       </w:tblBorders>
+      <w:tblCellMar>
+        <w:top w:w="0" w:type="dxa"/>
+        <w:left w:w="108" w:type="dxa"/>
+        <w:bottom w:w="0" w:type="dxa"/>
+        <w:right w:w="108" w:type="dxa"/>
+      </w:tblCellMar>
     </w:tblPr>
     <w:tblStylePr w:type="firstRow">
       <w:pPr>
@@ -5483,10 +5089,17 @@
     <w:tblPr>
       <w:tblStyleRowBandSize w:val="1"/>
       <w:tblStyleColBandSize w:val="1"/>
+      <w:tblInd w:w="0" w:type="dxa"/>
       <w:tblBorders>
         <w:top w:val="single" w:sz="18" w:space="0" w:color="auto"/>
         <w:bottom w:val="single" w:sz="18" w:space="0" w:color="auto"/>
       </w:tblBorders>
+      <w:tblCellMar>
+        <w:top w:w="0" w:type="dxa"/>
+        <w:left w:w="108" w:type="dxa"/>
+        <w:bottom w:w="0" w:type="dxa"/>
+        <w:right w:w="108" w:type="dxa"/>
+      </w:tblCellMar>
     </w:tblPr>
     <w:tblStylePr w:type="firstRow">
       <w:pPr>
@@ -5625,10 +5238,17 @@
     <w:tblPr>
       <w:tblStyleRowBandSize w:val="1"/>
       <w:tblStyleColBandSize w:val="1"/>
+      <w:tblInd w:w="0" w:type="dxa"/>
       <w:tblBorders>
         <w:top w:val="single" w:sz="18" w:space="0" w:color="auto"/>
         <w:bottom w:val="single" w:sz="18" w:space="0" w:color="auto"/>
       </w:tblBorders>
+      <w:tblCellMar>
+        <w:top w:w="0" w:type="dxa"/>
+        <w:left w:w="108" w:type="dxa"/>
+        <w:bottom w:w="0" w:type="dxa"/>
+        <w:right w:w="108" w:type="dxa"/>
+      </w:tblCellMar>
     </w:tblPr>
     <w:tblStylePr w:type="firstRow">
       <w:pPr>
@@ -5767,10 +5387,17 @@
     <w:tblPr>
       <w:tblStyleRowBandSize w:val="1"/>
       <w:tblStyleColBandSize w:val="1"/>
+      <w:tblInd w:w="0" w:type="dxa"/>
       <w:tblBorders>
         <w:top w:val="single" w:sz="18" w:space="0" w:color="auto"/>
         <w:bottom w:val="single" w:sz="18" w:space="0" w:color="auto"/>
       </w:tblBorders>
+      <w:tblCellMar>
+        <w:top w:w="0" w:type="dxa"/>
+        <w:left w:w="108" w:type="dxa"/>
+        <w:bottom w:w="0" w:type="dxa"/>
+        <w:right w:w="108" w:type="dxa"/>
+      </w:tblCellMar>
     </w:tblPr>
     <w:tblStylePr w:type="firstRow">
       <w:pPr>
@@ -5909,10 +5536,17 @@
     <w:tblPr>
       <w:tblStyleRowBandSize w:val="1"/>
       <w:tblStyleColBandSize w:val="1"/>
+      <w:tblInd w:w="0" w:type="dxa"/>
       <w:tblBorders>
         <w:top w:val="single" w:sz="18" w:space="0" w:color="auto"/>
         <w:bottom w:val="single" w:sz="18" w:space="0" w:color="auto"/>
       </w:tblBorders>
+      <w:tblCellMar>
+        <w:top w:w="0" w:type="dxa"/>
+        <w:left w:w="108" w:type="dxa"/>
+        <w:bottom w:w="0" w:type="dxa"/>
+        <w:right w:w="108" w:type="dxa"/>
+      </w:tblCellMar>
     </w:tblPr>
     <w:tblStylePr w:type="firstRow">
       <w:pPr>
@@ -6051,10 +5685,17 @@
     <w:tblPr>
       <w:tblStyleRowBandSize w:val="1"/>
       <w:tblStyleColBandSize w:val="1"/>
+      <w:tblInd w:w="0" w:type="dxa"/>
       <w:tblBorders>
         <w:top w:val="single" w:sz="18" w:space="0" w:color="auto"/>
         <w:bottom w:val="single" w:sz="18" w:space="0" w:color="auto"/>
       </w:tblBorders>
+      <w:tblCellMar>
+        <w:top w:w="0" w:type="dxa"/>
+        <w:left w:w="108" w:type="dxa"/>
+        <w:bottom w:w="0" w:type="dxa"/>
+        <w:right w:w="108" w:type="dxa"/>
+      </w:tblCellMar>
     </w:tblPr>
     <w:tblStylePr w:type="firstRow">
       <w:pPr>
@@ -6196,10 +5837,17 @@
     <w:tblPr>
       <w:tblStyleRowBandSize w:val="1"/>
       <w:tblStyleColBandSize w:val="1"/>
+      <w:tblInd w:w="0" w:type="dxa"/>
       <w:tblBorders>
         <w:top w:val="single" w:sz="8" w:space="0" w:color="000000" w:themeColor="text1"/>
         <w:bottom w:val="single" w:sz="8" w:space="0" w:color="000000" w:themeColor="text1"/>
       </w:tblBorders>
+      <w:tblCellMar>
+        <w:top w:w="0" w:type="dxa"/>
+        <w:left w:w="108" w:type="dxa"/>
+        <w:bottom w:w="0" w:type="dxa"/>
+        <w:right w:w="108" w:type="dxa"/>
+      </w:tblCellMar>
     </w:tblPr>
     <w:tblStylePr w:type="firstRow">
       <w:rPr>
@@ -6273,10 +5921,17 @@
     <w:tblPr>
       <w:tblStyleRowBandSize w:val="1"/>
       <w:tblStyleColBandSize w:val="1"/>
+      <w:tblInd w:w="0" w:type="dxa"/>
       <w:tblBorders>
         <w:top w:val="single" w:sz="8" w:space="0" w:color="4F81BD" w:themeColor="accent1"/>
         <w:bottom w:val="single" w:sz="8" w:space="0" w:color="4F81BD" w:themeColor="accent1"/>
       </w:tblBorders>
+      <w:tblCellMar>
+        <w:top w:w="0" w:type="dxa"/>
+        <w:left w:w="108" w:type="dxa"/>
+        <w:bottom w:w="0" w:type="dxa"/>
+        <w:right w:w="108" w:type="dxa"/>
+      </w:tblCellMar>
     </w:tblPr>
     <w:tblStylePr w:type="firstRow">
       <w:rPr>
@@ -6350,10 +6005,17 @@
     <w:tblPr>
       <w:tblStyleRowBandSize w:val="1"/>
       <w:tblStyleColBandSize w:val="1"/>
+      <w:tblInd w:w="0" w:type="dxa"/>
       <w:tblBorders>
         <w:top w:val="single" w:sz="8" w:space="0" w:color="C0504D" w:themeColor="accent2"/>
         <w:bottom w:val="single" w:sz="8" w:space="0" w:color="C0504D" w:themeColor="accent2"/>
       </w:tblBorders>
+      <w:tblCellMar>
+        <w:top w:w="0" w:type="dxa"/>
+        <w:left w:w="108" w:type="dxa"/>
+        <w:bottom w:w="0" w:type="dxa"/>
+        <w:right w:w="108" w:type="dxa"/>
+      </w:tblCellMar>
     </w:tblPr>
     <w:tblStylePr w:type="firstRow">
       <w:rPr>
@@ -6427,10 +6089,17 @@
     <w:tblPr>
       <w:tblStyleRowBandSize w:val="1"/>
       <w:tblStyleColBandSize w:val="1"/>
+      <w:tblInd w:w="0" w:type="dxa"/>
       <w:tblBorders>
         <w:top w:val="single" w:sz="8" w:space="0" w:color="9BBB59" w:themeColor="accent3"/>
         <w:bottom w:val="single" w:sz="8" w:space="0" w:color="9BBB59" w:themeColor="accent3"/>
       </w:tblBorders>
+      <w:tblCellMar>
+        <w:top w:w="0" w:type="dxa"/>
+        <w:left w:w="108" w:type="dxa"/>
+        <w:bottom w:w="0" w:type="dxa"/>
+        <w:right w:w="108" w:type="dxa"/>
+      </w:tblCellMar>
     </w:tblPr>
     <w:tblStylePr w:type="firstRow">
       <w:rPr>
@@ -6504,10 +6173,17 @@
     <w:tblPr>
       <w:tblStyleRowBandSize w:val="1"/>
       <w:tblStyleColBandSize w:val="1"/>
+      <w:tblInd w:w="0" w:type="dxa"/>
       <w:tblBorders>
         <w:top w:val="single" w:sz="8" w:space="0" w:color="8064A2" w:themeColor="accent4"/>
         <w:bottom w:val="single" w:sz="8" w:space="0" w:color="8064A2" w:themeColor="accent4"/>
       </w:tblBorders>
+      <w:tblCellMar>
+        <w:top w:w="0" w:type="dxa"/>
+        <w:left w:w="108" w:type="dxa"/>
+        <w:bottom w:w="0" w:type="dxa"/>
+        <w:right w:w="108" w:type="dxa"/>
+      </w:tblCellMar>
     </w:tblPr>
     <w:tblStylePr w:type="firstRow">
       <w:rPr>
@@ -6581,10 +6257,17 @@
     <w:tblPr>
       <w:tblStyleRowBandSize w:val="1"/>
       <w:tblStyleColBandSize w:val="1"/>
+      <w:tblInd w:w="0" w:type="dxa"/>
       <w:tblBorders>
         <w:top w:val="single" w:sz="8" w:space="0" w:color="4BACC6" w:themeColor="accent5"/>
         <w:bottom w:val="single" w:sz="8" w:space="0" w:color="4BACC6" w:themeColor="accent5"/>
       </w:tblBorders>
+      <w:tblCellMar>
+        <w:top w:w="0" w:type="dxa"/>
+        <w:left w:w="108" w:type="dxa"/>
+        <w:bottom w:w="0" w:type="dxa"/>
+        <w:right w:w="108" w:type="dxa"/>
+      </w:tblCellMar>
     </w:tblPr>
     <w:tblStylePr w:type="firstRow">
       <w:rPr>
@@ -6658,10 +6341,17 @@
     <w:tblPr>
       <w:tblStyleRowBandSize w:val="1"/>
       <w:tblStyleColBandSize w:val="1"/>
+      <w:tblInd w:w="0" w:type="dxa"/>
       <w:tblBorders>
         <w:top w:val="single" w:sz="8" w:space="0" w:color="F79646" w:themeColor="accent6"/>
         <w:bottom w:val="single" w:sz="8" w:space="0" w:color="F79646" w:themeColor="accent6"/>
       </w:tblBorders>
+      <w:tblCellMar>
+        <w:top w:w="0" w:type="dxa"/>
+        <w:left w:w="108" w:type="dxa"/>
+        <w:bottom w:w="0" w:type="dxa"/>
+        <w:right w:w="108" w:type="dxa"/>
+      </w:tblCellMar>
     </w:tblPr>
     <w:tblStylePr w:type="firstRow">
       <w:rPr>
@@ -6736,12 +6426,19 @@
     <w:tblPr>
       <w:tblStyleRowBandSize w:val="1"/>
       <w:tblStyleColBandSize w:val="1"/>
+      <w:tblInd w:w="0" w:type="dxa"/>
       <w:tblBorders>
         <w:top w:val="single" w:sz="8" w:space="0" w:color="000000" w:themeColor="text1"/>
         <w:left w:val="single" w:sz="8" w:space="0" w:color="000000" w:themeColor="text1"/>
         <w:bottom w:val="single" w:sz="8" w:space="0" w:color="000000" w:themeColor="text1"/>
         <w:right w:val="single" w:sz="8" w:space="0" w:color="000000" w:themeColor="text1"/>
       </w:tblBorders>
+      <w:tblCellMar>
+        <w:top w:w="0" w:type="dxa"/>
+        <w:left w:w="108" w:type="dxa"/>
+        <w:bottom w:w="0" w:type="dxa"/>
+        <w:right w:w="108" w:type="dxa"/>
+      </w:tblCellMar>
     </w:tblPr>
     <w:tblStylePr w:type="firstRow">
       <w:rPr>
@@ -6857,12 +6554,19 @@
     <w:tblPr>
       <w:tblStyleRowBandSize w:val="1"/>
       <w:tblStyleColBandSize w:val="1"/>
+      <w:tblInd w:w="0" w:type="dxa"/>
       <w:tblBorders>
         <w:top w:val="single" w:sz="8" w:space="0" w:color="4F81BD" w:themeColor="accent1"/>
         <w:left w:val="single" w:sz="8" w:space="0" w:color="4F81BD" w:themeColor="accent1"/>
         <w:bottom w:val="single" w:sz="8" w:space="0" w:color="4F81BD" w:themeColor="accent1"/>
         <w:right w:val="single" w:sz="8" w:space="0" w:color="4F81BD" w:themeColor="accent1"/>
       </w:tblBorders>
+      <w:tblCellMar>
+        <w:top w:w="0" w:type="dxa"/>
+        <w:left w:w="108" w:type="dxa"/>
+        <w:bottom w:w="0" w:type="dxa"/>
+        <w:right w:w="108" w:type="dxa"/>
+      </w:tblCellMar>
     </w:tblPr>
     <w:tblStylePr w:type="firstRow">
       <w:rPr>
@@ -6978,12 +6682,19 @@
     <w:tblPr>
       <w:tblStyleRowBandSize w:val="1"/>
       <w:tblStyleColBandSize w:val="1"/>
+      <w:tblInd w:w="0" w:type="dxa"/>
       <w:tblBorders>
         <w:top w:val="single" w:sz="8" w:space="0" w:color="C0504D" w:themeColor="accent2"/>
         <w:left w:val="single" w:sz="8" w:space="0" w:color="C0504D" w:themeColor="accent2"/>
         <w:bottom w:val="single" w:sz="8" w:space="0" w:color="C0504D" w:themeColor="accent2"/>
         <w:right w:val="single" w:sz="8" w:space="0" w:color="C0504D" w:themeColor="accent2"/>
       </w:tblBorders>
+      <w:tblCellMar>
+        <w:top w:w="0" w:type="dxa"/>
+        <w:left w:w="108" w:type="dxa"/>
+        <w:bottom w:w="0" w:type="dxa"/>
+        <w:right w:w="108" w:type="dxa"/>
+      </w:tblCellMar>
     </w:tblPr>
     <w:tblStylePr w:type="firstRow">
       <w:rPr>
@@ -7099,12 +6810,19 @@
     <w:tblPr>
       <w:tblStyleRowBandSize w:val="1"/>
       <w:tblStyleColBandSize w:val="1"/>
+      <w:tblInd w:w="0" w:type="dxa"/>
       <w:tblBorders>
         <w:top w:val="single" w:sz="8" w:space="0" w:color="9BBB59" w:themeColor="accent3"/>
         <w:left w:val="single" w:sz="8" w:space="0" w:color="9BBB59" w:themeColor="accent3"/>
         <w:bottom w:val="single" w:sz="8" w:space="0" w:color="9BBB59" w:themeColor="accent3"/>
         <w:right w:val="single" w:sz="8" w:space="0" w:color="9BBB59" w:themeColor="accent3"/>
       </w:tblBorders>
+      <w:tblCellMar>
+        <w:top w:w="0" w:type="dxa"/>
+        <w:left w:w="108" w:type="dxa"/>
+        <w:bottom w:w="0" w:type="dxa"/>
+        <w:right w:w="108" w:type="dxa"/>
+      </w:tblCellMar>
     </w:tblPr>
     <w:tblStylePr w:type="firstRow">
       <w:rPr>
@@ -7220,12 +6938,19 @@
     <w:tblPr>
       <w:tblStyleRowBandSize w:val="1"/>
       <w:tblStyleColBandSize w:val="1"/>
+      <w:tblInd w:w="0" w:type="dxa"/>
       <w:tblBorders>
         <w:top w:val="single" w:sz="8" w:space="0" w:color="8064A2" w:themeColor="accent4"/>
         <w:left w:val="single" w:sz="8" w:space="0" w:color="8064A2" w:themeColor="accent4"/>
         <w:bottom w:val="single" w:sz="8" w:space="0" w:color="8064A2" w:themeColor="accent4"/>
         <w:right w:val="single" w:sz="8" w:space="0" w:color="8064A2" w:themeColor="accent4"/>
       </w:tblBorders>
+      <w:tblCellMar>
+        <w:top w:w="0" w:type="dxa"/>
+        <w:left w:w="108" w:type="dxa"/>
+        <w:bottom w:w="0" w:type="dxa"/>
+        <w:right w:w="108" w:type="dxa"/>
+      </w:tblCellMar>
     </w:tblPr>
     <w:tblStylePr w:type="firstRow">
       <w:rPr>
@@ -7341,12 +7066,19 @@
     <w:tblPr>
       <w:tblStyleRowBandSize w:val="1"/>
       <w:tblStyleColBandSize w:val="1"/>
+      <w:tblInd w:w="0" w:type="dxa"/>
       <w:tblBorders>
         <w:top w:val="single" w:sz="8" w:space="0" w:color="4BACC6" w:themeColor="accent5"/>
         <w:left w:val="single" w:sz="8" w:space="0" w:color="4BACC6" w:themeColor="accent5"/>
         <w:bottom w:val="single" w:sz="8" w:space="0" w:color="4BACC6" w:themeColor="accent5"/>
         <w:right w:val="single" w:sz="8" w:space="0" w:color="4BACC6" w:themeColor="accent5"/>
       </w:tblBorders>
+      <w:tblCellMar>
+        <w:top w:w="0" w:type="dxa"/>
+        <w:left w:w="108" w:type="dxa"/>
+        <w:bottom w:w="0" w:type="dxa"/>
+        <w:right w:w="108" w:type="dxa"/>
+      </w:tblCellMar>
     </w:tblPr>
     <w:tblStylePr w:type="firstRow">
       <w:rPr>
@@ -7462,12 +7194,19 @@
     <w:tblPr>
       <w:tblStyleRowBandSize w:val="1"/>
       <w:tblStyleColBandSize w:val="1"/>
+      <w:tblInd w:w="0" w:type="dxa"/>
       <w:tblBorders>
         <w:top w:val="single" w:sz="8" w:space="0" w:color="F79646" w:themeColor="accent6"/>
         <w:left w:val="single" w:sz="8" w:space="0" w:color="F79646" w:themeColor="accent6"/>
         <w:bottom w:val="single" w:sz="8" w:space="0" w:color="F79646" w:themeColor="accent6"/>
         <w:right w:val="single" w:sz="8" w:space="0" w:color="F79646" w:themeColor="accent6"/>
       </w:tblBorders>
+      <w:tblCellMar>
+        <w:top w:w="0" w:type="dxa"/>
+        <w:left w:w="108" w:type="dxa"/>
+        <w:bottom w:w="0" w:type="dxa"/>
+        <w:right w:w="108" w:type="dxa"/>
+      </w:tblCellMar>
     </w:tblPr>
     <w:tblStylePr w:type="firstRow">
       <w:rPr>
@@ -7579,6 +7318,7 @@
     <w:tblPr>
       <w:tblStyleRowBandSize w:val="1"/>
       <w:tblStyleColBandSize w:val="1"/>
+      <w:tblInd w:w="0" w:type="dxa"/>
       <w:tblBorders>
         <w:top w:val="single" w:sz="8" w:space="0" w:color="404040" w:themeColor="text1" w:themeTint="BF"/>
         <w:left w:val="single" w:sz="8" w:space="0" w:color="404040" w:themeColor="text1" w:themeTint="BF"/>
@@ -7587,6 +7327,12 @@
         <w:insideH w:val="single" w:sz="8" w:space="0" w:color="404040" w:themeColor="text1" w:themeTint="BF"/>
         <w:insideV w:val="single" w:sz="8" w:space="0" w:color="404040" w:themeColor="text1" w:themeTint="BF"/>
       </w:tblBorders>
+      <w:tblCellMar>
+        <w:top w:w="0" w:type="dxa"/>
+        <w:left w:w="108" w:type="dxa"/>
+        <w:bottom w:w="0" w:type="dxa"/>
+        <w:right w:w="108" w:type="dxa"/>
+      </w:tblCellMar>
     </w:tblPr>
     <w:tcPr>
       <w:shd w:val="clear" w:color="auto" w:fill="C0C0C0" w:themeFill="text1" w:themeFillTint="3F"/>
@@ -7645,6 +7391,7 @@
     <w:tblPr>
       <w:tblStyleRowBandSize w:val="1"/>
       <w:tblStyleColBandSize w:val="1"/>
+      <w:tblInd w:w="0" w:type="dxa"/>
       <w:tblBorders>
         <w:top w:val="single" w:sz="8" w:space="0" w:color="7BA0CD" w:themeColor="accent1" w:themeTint="BF"/>
         <w:left w:val="single" w:sz="8" w:space="0" w:color="7BA0CD" w:themeColor="accent1" w:themeTint="BF"/>
@@ -7653,6 +7400,12 @@
         <w:insideH w:val="single" w:sz="8" w:space="0" w:color="7BA0CD" w:themeColor="accent1" w:themeTint="BF"/>
         <w:insideV w:val="single" w:sz="8" w:space="0" w:color="7BA0CD" w:themeColor="accent1" w:themeTint="BF"/>
       </w:tblBorders>
+      <w:tblCellMar>
+        <w:top w:w="0" w:type="dxa"/>
+        <w:left w:w="108" w:type="dxa"/>
+        <w:bottom w:w="0" w:type="dxa"/>
+        <w:right w:w="108" w:type="dxa"/>
+      </w:tblCellMar>
     </w:tblPr>
     <w:tcPr>
       <w:shd w:val="clear" w:color="auto" w:fill="D3DFEE" w:themeFill="accent1" w:themeFillTint="3F"/>
@@ -7711,6 +7464,7 @@
     <w:tblPr>
       <w:tblStyleRowBandSize w:val="1"/>
       <w:tblStyleColBandSize w:val="1"/>
+      <w:tblInd w:w="0" w:type="dxa"/>
       <w:tblBorders>
         <w:top w:val="single" w:sz="8" w:space="0" w:color="CF7B79" w:themeColor="accent2" w:themeTint="BF"/>
         <w:left w:val="single" w:sz="8" w:space="0" w:color="CF7B79" w:themeColor="accent2" w:themeTint="BF"/>
@@ -7719,6 +7473,12 @@
         <w:insideH w:val="single" w:sz="8" w:space="0" w:color="CF7B79" w:themeColor="accent2" w:themeTint="BF"/>
         <w:insideV w:val="single" w:sz="8" w:space="0" w:color="CF7B79" w:themeColor="accent2" w:themeTint="BF"/>
       </w:tblBorders>
+      <w:tblCellMar>
+        <w:top w:w="0" w:type="dxa"/>
+        <w:left w:w="108" w:type="dxa"/>
+        <w:bottom w:w="0" w:type="dxa"/>
+        <w:right w:w="108" w:type="dxa"/>
+      </w:tblCellMar>
     </w:tblPr>
     <w:tcPr>
       <w:shd w:val="clear" w:color="auto" w:fill="EFD3D2" w:themeFill="accent2" w:themeFillTint="3F"/>
@@ -7777,6 +7537,7 @@
     <w:tblPr>
       <w:tblStyleRowBandSize w:val="1"/>
       <w:tblStyleColBandSize w:val="1"/>
+      <w:tblInd w:w="0" w:type="dxa"/>
       <w:tblBorders>
         <w:top w:val="single" w:sz="8" w:space="0" w:color="B3CC82" w:themeColor="accent3" w:themeTint="BF"/>
         <w:left w:val="single" w:sz="8" w:space="0" w:color="B3CC82" w:themeColor="accent3" w:themeTint="BF"/>
@@ -7785,6 +7546,12 @@
         <w:insideH w:val="single" w:sz="8" w:space="0" w:color="B3CC82" w:themeColor="accent3" w:themeTint="BF"/>
         <w:insideV w:val="single" w:sz="8" w:space="0" w:color="B3CC82" w:themeColor="accent3" w:themeTint="BF"/>
       </w:tblBorders>
+      <w:tblCellMar>
+        <w:top w:w="0" w:type="dxa"/>
+        <w:left w:w="108" w:type="dxa"/>
+        <w:bottom w:w="0" w:type="dxa"/>
+        <w:right w:w="108" w:type="dxa"/>
+      </w:tblCellMar>
     </w:tblPr>
     <w:tcPr>
       <w:shd w:val="clear" w:color="auto" w:fill="E6EED5" w:themeFill="accent3" w:themeFillTint="3F"/>
@@ -7843,6 +7610,7 @@
     <w:tblPr>
       <w:tblStyleRowBandSize w:val="1"/>
       <w:tblStyleColBandSize w:val="1"/>
+      <w:tblInd w:w="0" w:type="dxa"/>
       <w:tblBorders>
         <w:top w:val="single" w:sz="8" w:space="0" w:color="9F8AB9" w:themeColor="accent4" w:themeTint="BF"/>
         <w:left w:val="single" w:sz="8" w:space="0" w:color="9F8AB9" w:themeColor="accent4" w:themeTint="BF"/>
@@ -7851,6 +7619,12 @@
         <w:insideH w:val="single" w:sz="8" w:space="0" w:color="9F8AB9" w:themeColor="accent4" w:themeTint="BF"/>
         <w:insideV w:val="single" w:sz="8" w:space="0" w:color="9F8AB9" w:themeColor="accent4" w:themeTint="BF"/>
       </w:tblBorders>
+      <w:tblCellMar>
+        <w:top w:w="0" w:type="dxa"/>
+        <w:left w:w="108" w:type="dxa"/>
+        <w:bottom w:w="0" w:type="dxa"/>
+        <w:right w:w="108" w:type="dxa"/>
+      </w:tblCellMar>
     </w:tblPr>
     <w:tcPr>
       <w:shd w:val="clear" w:color="auto" w:fill="DFD8E8" w:themeFill="accent4" w:themeFillTint="3F"/>
@@ -7909,6 +7683,7 @@
     <w:tblPr>
       <w:tblStyleRowBandSize w:val="1"/>
       <w:tblStyleColBandSize w:val="1"/>
+      <w:tblInd w:w="0" w:type="dxa"/>
       <w:tblBorders>
         <w:top w:val="single" w:sz="8" w:space="0" w:color="78C0D4" w:themeColor="accent5" w:themeTint="BF"/>
         <w:left w:val="single" w:sz="8" w:space="0" w:color="78C0D4" w:themeColor="accent5" w:themeTint="BF"/>
@@ -7917,6 +7692,12 @@
         <w:insideH w:val="single" w:sz="8" w:space="0" w:color="78C0D4" w:themeColor="accent5" w:themeTint="BF"/>
         <w:insideV w:val="single" w:sz="8" w:space="0" w:color="78C0D4" w:themeColor="accent5" w:themeTint="BF"/>
       </w:tblBorders>
+      <w:tblCellMar>
+        <w:top w:w="0" w:type="dxa"/>
+        <w:left w:w="108" w:type="dxa"/>
+        <w:bottom w:w="0" w:type="dxa"/>
+        <w:right w:w="108" w:type="dxa"/>
+      </w:tblCellMar>
     </w:tblPr>
     <w:tcPr>
       <w:shd w:val="clear" w:color="auto" w:fill="D2EAF1" w:themeFill="accent5" w:themeFillTint="3F"/>
@@ -7975,6 +7756,7 @@
     <w:tblPr>
       <w:tblStyleRowBandSize w:val="1"/>
       <w:tblStyleColBandSize w:val="1"/>
+      <w:tblInd w:w="0" w:type="dxa"/>
       <w:tblBorders>
         <w:top w:val="single" w:sz="8" w:space="0" w:color="F9B074" w:themeColor="accent6" w:themeTint="BF"/>
         <w:left w:val="single" w:sz="8" w:space="0" w:color="F9B074" w:themeColor="accent6" w:themeTint="BF"/>
@@ -7983,6 +7765,12 @@
         <w:insideH w:val="single" w:sz="8" w:space="0" w:color="F9B074" w:themeColor="accent6" w:themeTint="BF"/>
         <w:insideV w:val="single" w:sz="8" w:space="0" w:color="F9B074" w:themeColor="accent6" w:themeTint="BF"/>
       </w:tblBorders>
+      <w:tblCellMar>
+        <w:top w:w="0" w:type="dxa"/>
+        <w:left w:w="108" w:type="dxa"/>
+        <w:bottom w:w="0" w:type="dxa"/>
+        <w:right w:w="108" w:type="dxa"/>
+      </w:tblCellMar>
     </w:tblPr>
     <w:tcPr>
       <w:shd w:val="clear" w:color="auto" w:fill="FDE4D0" w:themeFill="accent6" w:themeFillTint="3F"/>
@@ -8045,6 +7833,7 @@
     <w:tblPr>
       <w:tblStyleRowBandSize w:val="1"/>
       <w:tblStyleColBandSize w:val="1"/>
+      <w:tblInd w:w="0" w:type="dxa"/>
       <w:tblBorders>
         <w:top w:val="single" w:sz="8" w:space="0" w:color="000000" w:themeColor="text1"/>
         <w:left w:val="single" w:sz="8" w:space="0" w:color="000000" w:themeColor="text1"/>
@@ -8053,6 +7842,12 @@
         <w:insideH w:val="single" w:sz="8" w:space="0" w:color="000000" w:themeColor="text1"/>
         <w:insideV w:val="single" w:sz="8" w:space="0" w:color="000000" w:themeColor="text1"/>
       </w:tblBorders>
+      <w:tblCellMar>
+        <w:top w:w="0" w:type="dxa"/>
+        <w:left w:w="108" w:type="dxa"/>
+        <w:bottom w:w="0" w:type="dxa"/>
+        <w:right w:w="108" w:type="dxa"/>
+      </w:tblCellMar>
     </w:tblPr>
     <w:tcPr>
       <w:shd w:val="clear" w:color="auto" w:fill="C0C0C0" w:themeFill="text1" w:themeFillTint="3F"/>
@@ -8163,6 +7958,7 @@
     <w:tblPr>
       <w:tblStyleRowBandSize w:val="1"/>
       <w:tblStyleColBandSize w:val="1"/>
+      <w:tblInd w:w="0" w:type="dxa"/>
       <w:tblBorders>
         <w:top w:val="single" w:sz="8" w:space="0" w:color="4F81BD" w:themeColor="accent1"/>
         <w:left w:val="single" w:sz="8" w:space="0" w:color="4F81BD" w:themeColor="accent1"/>
@@ -8171,6 +7967,12 @@
         <w:insideH w:val="single" w:sz="8" w:space="0" w:color="4F81BD" w:themeColor="accent1"/>
         <w:insideV w:val="single" w:sz="8" w:space="0" w:color="4F81BD" w:themeColor="accent1"/>
       </w:tblBorders>
+      <w:tblCellMar>
+        <w:top w:w="0" w:type="dxa"/>
+        <w:left w:w="108" w:type="dxa"/>
+        <w:bottom w:w="0" w:type="dxa"/>
+        <w:right w:w="108" w:type="dxa"/>
+      </w:tblCellMar>
     </w:tblPr>
     <w:tcPr>
       <w:shd w:val="clear" w:color="auto" w:fill="D3DFEE" w:themeFill="accent1" w:themeFillTint="3F"/>
@@ -8281,6 +8083,7 @@
     <w:tblPr>
       <w:tblStyleRowBandSize w:val="1"/>
       <w:tblStyleColBandSize w:val="1"/>
+      <w:tblInd w:w="0" w:type="dxa"/>
       <w:tblBorders>
         <w:top w:val="single" w:sz="8" w:space="0" w:color="C0504D" w:themeColor="accent2"/>
         <w:left w:val="single" w:sz="8" w:space="0" w:color="C0504D" w:themeColor="accent2"/>
@@ -8289,6 +8092,12 @@
         <w:insideH w:val="single" w:sz="8" w:space="0" w:color="C0504D" w:themeColor="accent2"/>
         <w:insideV w:val="single" w:sz="8" w:space="0" w:color="C0504D" w:themeColor="accent2"/>
       </w:tblBorders>
+      <w:tblCellMar>
+        <w:top w:w="0" w:type="dxa"/>
+        <w:left w:w="108" w:type="dxa"/>
+        <w:bottom w:w="0" w:type="dxa"/>
+        <w:right w:w="108" w:type="dxa"/>
+      </w:tblCellMar>
     </w:tblPr>
     <w:tcPr>
       <w:shd w:val="clear" w:color="auto" w:fill="EFD3D2" w:themeFill="accent2" w:themeFillTint="3F"/>
@@ -8399,6 +8208,7 @@
     <w:tblPr>
       <w:tblStyleRowBandSize w:val="1"/>
       <w:tblStyleColBandSize w:val="1"/>
+      <w:tblInd w:w="0" w:type="dxa"/>
       <w:tblBorders>
         <w:top w:val="single" w:sz="8" w:space="0" w:color="9BBB59" w:themeColor="accent3"/>
         <w:left w:val="single" w:sz="8" w:space="0" w:color="9BBB59" w:themeColor="accent3"/>
@@ -8407,6 +8217,12 @@
         <w:insideH w:val="single" w:sz="8" w:space="0" w:color="9BBB59" w:themeColor="accent3"/>
         <w:insideV w:val="single" w:sz="8" w:space="0" w:color="9BBB59" w:themeColor="accent3"/>
       </w:tblBorders>
+      <w:tblCellMar>
+        <w:top w:w="0" w:type="dxa"/>
+        <w:left w:w="108" w:type="dxa"/>
+        <w:bottom w:w="0" w:type="dxa"/>
+        <w:right w:w="108" w:type="dxa"/>
+      </w:tblCellMar>
     </w:tblPr>
     <w:tcPr>
       <w:shd w:val="clear" w:color="auto" w:fill="E6EED5" w:themeFill="accent3" w:themeFillTint="3F"/>
@@ -8517,6 +8333,7 @@
     <w:tblPr>
       <w:tblStyleRowBandSize w:val="1"/>
       <w:tblStyleColBandSize w:val="1"/>
+      <w:tblInd w:w="0" w:type="dxa"/>
       <w:tblBorders>
         <w:top w:val="single" w:sz="8" w:space="0" w:color="8064A2" w:themeColor="accent4"/>
         <w:left w:val="single" w:sz="8" w:space="0" w:color="8064A2" w:themeColor="accent4"/>
@@ -8525,6 +8342,12 @@
         <w:insideH w:val="single" w:sz="8" w:space="0" w:color="8064A2" w:themeColor="accent4"/>
         <w:insideV w:val="single" w:sz="8" w:space="0" w:color="8064A2" w:themeColor="accent4"/>
       </w:tblBorders>
+      <w:tblCellMar>
+        <w:top w:w="0" w:type="dxa"/>
+        <w:left w:w="108" w:type="dxa"/>
+        <w:bottom w:w="0" w:type="dxa"/>
+        <w:right w:w="108" w:type="dxa"/>
+      </w:tblCellMar>
     </w:tblPr>
     <w:tcPr>
       <w:shd w:val="clear" w:color="auto" w:fill="DFD8E8" w:themeFill="accent4" w:themeFillTint="3F"/>
@@ -8635,6 +8458,7 @@
     <w:tblPr>
       <w:tblStyleRowBandSize w:val="1"/>
       <w:tblStyleColBandSize w:val="1"/>
+      <w:tblInd w:w="0" w:type="dxa"/>
       <w:tblBorders>
         <w:top w:val="single" w:sz="8" w:space="0" w:color="4BACC6" w:themeColor="accent5"/>
         <w:left w:val="single" w:sz="8" w:space="0" w:color="4BACC6" w:themeColor="accent5"/>
@@ -8643,6 +8467,12 @@
         <w:insideH w:val="single" w:sz="8" w:space="0" w:color="4BACC6" w:themeColor="accent5"/>
         <w:insideV w:val="single" w:sz="8" w:space="0" w:color="4BACC6" w:themeColor="accent5"/>
       </w:tblBorders>
+      <w:tblCellMar>
+        <w:top w:w="0" w:type="dxa"/>
+        <w:left w:w="108" w:type="dxa"/>
+        <w:bottom w:w="0" w:type="dxa"/>
+        <w:right w:w="108" w:type="dxa"/>
+      </w:tblCellMar>
     </w:tblPr>
     <w:tcPr>
       <w:shd w:val="clear" w:color="auto" w:fill="D2EAF1" w:themeFill="accent5" w:themeFillTint="3F"/>
@@ -8753,6 +8583,7 @@
     <w:tblPr>
       <w:tblStyleRowBandSize w:val="1"/>
       <w:tblStyleColBandSize w:val="1"/>
+      <w:tblInd w:w="0" w:type="dxa"/>
       <w:tblBorders>
         <w:top w:val="single" w:sz="8" w:space="0" w:color="F79646" w:themeColor="accent6"/>
         <w:left w:val="single" w:sz="8" w:space="0" w:color="F79646" w:themeColor="accent6"/>
@@ -8761,6 +8592,12 @@
         <w:insideH w:val="single" w:sz="8" w:space="0" w:color="F79646" w:themeColor="accent6"/>
         <w:insideV w:val="single" w:sz="8" w:space="0" w:color="F79646" w:themeColor="accent6"/>
       </w:tblBorders>
+      <w:tblCellMar>
+        <w:top w:w="0" w:type="dxa"/>
+        <w:left w:w="108" w:type="dxa"/>
+        <w:bottom w:w="0" w:type="dxa"/>
+        <w:right w:w="108" w:type="dxa"/>
+      </w:tblCellMar>
     </w:tblPr>
     <w:tcPr>
       <w:shd w:val="clear" w:color="auto" w:fill="FDE4D0" w:themeFill="accent6" w:themeFillTint="3F"/>
@@ -8867,6 +8704,7 @@
     <w:tblPr>
       <w:tblStyleRowBandSize w:val="1"/>
       <w:tblStyleColBandSize w:val="1"/>
+      <w:tblInd w:w="0" w:type="dxa"/>
       <w:tblBorders>
         <w:top w:val="single" w:sz="8" w:space="0" w:color="FFFFFF" w:themeColor="background1"/>
         <w:left w:val="single" w:sz="8" w:space="0" w:color="FFFFFF" w:themeColor="background1"/>
@@ -8875,6 +8713,12 @@
         <w:insideH w:val="single" w:sz="6" w:space="0" w:color="FFFFFF" w:themeColor="background1"/>
         <w:insideV w:val="single" w:sz="6" w:space="0" w:color="FFFFFF" w:themeColor="background1"/>
       </w:tblBorders>
+      <w:tblCellMar>
+        <w:top w:w="0" w:type="dxa"/>
+        <w:left w:w="108" w:type="dxa"/>
+        <w:bottom w:w="0" w:type="dxa"/>
+        <w:right w:w="108" w:type="dxa"/>
+      </w:tblCellMar>
     </w:tblPr>
     <w:tcPr>
       <w:shd w:val="clear" w:color="auto" w:fill="C0C0C0" w:themeFill="text1" w:themeFillTint="3F"/>
@@ -9001,6 +8845,7 @@
     <w:tblPr>
       <w:tblStyleRowBandSize w:val="1"/>
       <w:tblStyleColBandSize w:val="1"/>
+      <w:tblInd w:w="0" w:type="dxa"/>
       <w:tblBorders>
         <w:top w:val="single" w:sz="8" w:space="0" w:color="FFFFFF" w:themeColor="background1"/>
         <w:left w:val="single" w:sz="8" w:space="0" w:color="FFFFFF" w:themeColor="background1"/>
@@ -9009,6 +8854,12 @@
         <w:insideH w:val="single" w:sz="6" w:space="0" w:color="FFFFFF" w:themeColor="background1"/>
         <w:insideV w:val="single" w:sz="6" w:space="0" w:color="FFFFFF" w:themeColor="background1"/>
       </w:tblBorders>
+      <w:tblCellMar>
+        <w:top w:w="0" w:type="dxa"/>
+        <w:left w:w="108" w:type="dxa"/>
+        <w:bottom w:w="0" w:type="dxa"/>
+        <w:right w:w="108" w:type="dxa"/>
+      </w:tblCellMar>
     </w:tblPr>
     <w:tcPr>
       <w:shd w:val="clear" w:color="auto" w:fill="D3DFEE" w:themeFill="accent1" w:themeFillTint="3F"/>
@@ -9135,6 +8986,7 @@
     <w:tblPr>
       <w:tblStyleRowBandSize w:val="1"/>
       <w:tblStyleColBandSize w:val="1"/>
+      <w:tblInd w:w="0" w:type="dxa"/>
       <w:tblBorders>
         <w:top w:val="single" w:sz="8" w:space="0" w:color="FFFFFF" w:themeColor="background1"/>
         <w:left w:val="single" w:sz="8" w:space="0" w:color="FFFFFF" w:themeColor="background1"/>
@@ -9143,6 +8995,12 @@
         <w:insideH w:val="single" w:sz="6" w:space="0" w:color="FFFFFF" w:themeColor="background1"/>
         <w:insideV w:val="single" w:sz="6" w:space="0" w:color="FFFFFF" w:themeColor="background1"/>
       </w:tblBorders>
+      <w:tblCellMar>
+        <w:top w:w="0" w:type="dxa"/>
+        <w:left w:w="108" w:type="dxa"/>
+        <w:bottom w:w="0" w:type="dxa"/>
+        <w:right w:w="108" w:type="dxa"/>
+      </w:tblCellMar>
     </w:tblPr>
     <w:tcPr>
       <w:shd w:val="clear" w:color="auto" w:fill="EFD3D2" w:themeFill="accent2" w:themeFillTint="3F"/>
@@ -9269,6 +9127,7 @@
     <w:tblPr>
       <w:tblStyleRowBandSize w:val="1"/>
       <w:tblStyleColBandSize w:val="1"/>
+      <w:tblInd w:w="0" w:type="dxa"/>
       <w:tblBorders>
         <w:top w:val="single" w:sz="8" w:space="0" w:color="FFFFFF" w:themeColor="background1"/>
         <w:left w:val="single" w:sz="8" w:space="0" w:color="FFFFFF" w:themeColor="background1"/>
@@ -9277,6 +9136,12 @@
         <w:insideH w:val="single" w:sz="6" w:space="0" w:color="FFFFFF" w:themeColor="background1"/>
         <w:insideV w:val="single" w:sz="6" w:space="0" w:color="FFFFFF" w:themeColor="background1"/>
       </w:tblBorders>
+      <w:tblCellMar>
+        <w:top w:w="0" w:type="dxa"/>
+        <w:left w:w="108" w:type="dxa"/>
+        <w:bottom w:w="0" w:type="dxa"/>
+        <w:right w:w="108" w:type="dxa"/>
+      </w:tblCellMar>
     </w:tblPr>
     <w:tcPr>
       <w:shd w:val="clear" w:color="auto" w:fill="E6EED5" w:themeFill="accent3" w:themeFillTint="3F"/>
@@ -9403,6 +9268,7 @@
     <w:tblPr>
       <w:tblStyleRowBandSize w:val="1"/>
       <w:tblStyleColBandSize w:val="1"/>
+      <w:tblInd w:w="0" w:type="dxa"/>
       <w:tblBorders>
         <w:top w:val="single" w:sz="8" w:space="0" w:color="FFFFFF" w:themeColor="background1"/>
         <w:left w:val="single" w:sz="8" w:space="0" w:color="FFFFFF" w:themeColor="background1"/>
@@ -9411,6 +9277,12 @@
         <w:insideH w:val="single" w:sz="6" w:space="0" w:color="FFFFFF" w:themeColor="background1"/>
         <w:insideV w:val="single" w:sz="6" w:space="0" w:color="FFFFFF" w:themeColor="background1"/>
       </w:tblBorders>
+      <w:tblCellMar>
+        <w:top w:w="0" w:type="dxa"/>
+        <w:left w:w="108" w:type="dxa"/>
+        <w:bottom w:w="0" w:type="dxa"/>
+        <w:right w:w="108" w:type="dxa"/>
+      </w:tblCellMar>
     </w:tblPr>
     <w:tcPr>
       <w:shd w:val="clear" w:color="auto" w:fill="DFD8E8" w:themeFill="accent4" w:themeFillTint="3F"/>
@@ -9537,6 +9409,7 @@
     <w:tblPr>
       <w:tblStyleRowBandSize w:val="1"/>
       <w:tblStyleColBandSize w:val="1"/>
+      <w:tblInd w:w="0" w:type="dxa"/>
       <w:tblBorders>
         <w:top w:val="single" w:sz="8" w:space="0" w:color="FFFFFF" w:themeColor="background1"/>
         <w:left w:val="single" w:sz="8" w:space="0" w:color="FFFFFF" w:themeColor="background1"/>
@@ -9545,6 +9418,12 @@
         <w:insideH w:val="single" w:sz="6" w:space="0" w:color="FFFFFF" w:themeColor="background1"/>
         <w:insideV w:val="single" w:sz="6" w:space="0" w:color="FFFFFF" w:themeColor="background1"/>
       </w:tblBorders>
+      <w:tblCellMar>
+        <w:top w:w="0" w:type="dxa"/>
+        <w:left w:w="108" w:type="dxa"/>
+        <w:bottom w:w="0" w:type="dxa"/>
+        <w:right w:w="108" w:type="dxa"/>
+      </w:tblCellMar>
     </w:tblPr>
     <w:tcPr>
       <w:shd w:val="clear" w:color="auto" w:fill="D2EAF1" w:themeFill="accent5" w:themeFillTint="3F"/>
@@ -9671,6 +9550,7 @@
     <w:tblPr>
       <w:tblStyleRowBandSize w:val="1"/>
       <w:tblStyleColBandSize w:val="1"/>
+      <w:tblInd w:w="0" w:type="dxa"/>
       <w:tblBorders>
         <w:top w:val="single" w:sz="8" w:space="0" w:color="FFFFFF" w:themeColor="background1"/>
         <w:left w:val="single" w:sz="8" w:space="0" w:color="FFFFFF" w:themeColor="background1"/>
@@ -9679,6 +9559,12 @@
         <w:insideH w:val="single" w:sz="6" w:space="0" w:color="FFFFFF" w:themeColor="background1"/>
         <w:insideV w:val="single" w:sz="6" w:space="0" w:color="FFFFFF" w:themeColor="background1"/>
       </w:tblBorders>
+      <w:tblCellMar>
+        <w:top w:w="0" w:type="dxa"/>
+        <w:left w:w="108" w:type="dxa"/>
+        <w:bottom w:w="0" w:type="dxa"/>
+        <w:right w:w="108" w:type="dxa"/>
+      </w:tblCellMar>
     </w:tblPr>
     <w:tcPr>
       <w:shd w:val="clear" w:color="auto" w:fill="FDE4D0" w:themeFill="accent6" w:themeFillTint="3F"/>
@@ -9808,6 +9694,13 @@
     <w:tblPr>
       <w:tblStyleRowBandSize w:val="1"/>
       <w:tblStyleColBandSize w:val="1"/>
+      <w:tblInd w:w="0" w:type="dxa"/>
+      <w:tblCellMar>
+        <w:top w:w="0" w:type="dxa"/>
+        <w:left w:w="108" w:type="dxa"/>
+        <w:bottom w:w="0" w:type="dxa"/>
+        <w:right w:w="108" w:type="dxa"/>
+      </w:tblCellMar>
     </w:tblPr>
     <w:tcPr>
       <w:shd w:val="clear" w:color="auto" w:fill="000000" w:themeFill="text1"/>
@@ -9915,6 +9808,13 @@
     <w:tblPr>
       <w:tblStyleRowBandSize w:val="1"/>
       <w:tblStyleColBandSize w:val="1"/>
+      <w:tblInd w:w="0" w:type="dxa"/>
+      <w:tblCellMar>
+        <w:top w:w="0" w:type="dxa"/>
+        <w:left w:w="108" w:type="dxa"/>
+        <w:bottom w:w="0" w:type="dxa"/>
+        <w:right w:w="108" w:type="dxa"/>
+      </w:tblCellMar>
     </w:tblPr>
     <w:tcPr>
       <w:shd w:val="clear" w:color="auto" w:fill="4F81BD" w:themeFill="accent1"/>
@@ -10022,6 +9922,13 @@
     <w:tblPr>
       <w:tblStyleRowBandSize w:val="1"/>
       <w:tblStyleColBandSize w:val="1"/>
+      <w:tblInd w:w="0" w:type="dxa"/>
+      <w:tblCellMar>
+        <w:top w:w="0" w:type="dxa"/>
+        <w:left w:w="108" w:type="dxa"/>
+        <w:bottom w:w="0" w:type="dxa"/>
+        <w:right w:w="108" w:type="dxa"/>
+      </w:tblCellMar>
     </w:tblPr>
     <w:tcPr>
       <w:shd w:val="clear" w:color="auto" w:fill="C0504D" w:themeFill="accent2"/>
@@ -10129,6 +10036,13 @@
     <w:tblPr>
       <w:tblStyleRowBandSize w:val="1"/>
       <w:tblStyleColBandSize w:val="1"/>
+      <w:tblInd w:w="0" w:type="dxa"/>
+      <w:tblCellMar>
+        <w:top w:w="0" w:type="dxa"/>
+        <w:left w:w="108" w:type="dxa"/>
+        <w:bottom w:w="0" w:type="dxa"/>
+        <w:right w:w="108" w:type="dxa"/>
+      </w:tblCellMar>
     </w:tblPr>
     <w:tcPr>
       <w:shd w:val="clear" w:color="auto" w:fill="9BBB59" w:themeFill="accent3"/>
@@ -10236,6 +10150,13 @@
     <w:tblPr>
       <w:tblStyleRowBandSize w:val="1"/>
       <w:tblStyleColBandSize w:val="1"/>
+      <w:tblInd w:w="0" w:type="dxa"/>
+      <w:tblCellMar>
+        <w:top w:w="0" w:type="dxa"/>
+        <w:left w:w="108" w:type="dxa"/>
+        <w:bottom w:w="0" w:type="dxa"/>
+        <w:right w:w="108" w:type="dxa"/>
+      </w:tblCellMar>
     </w:tblPr>
     <w:tcPr>
       <w:shd w:val="clear" w:color="auto" w:fill="8064A2" w:themeFill="accent4"/>
@@ -10343,6 +10264,13 @@
     <w:tblPr>
       <w:tblStyleRowBandSize w:val="1"/>
       <w:tblStyleColBandSize w:val="1"/>
+      <w:tblInd w:w="0" w:type="dxa"/>
+      <w:tblCellMar>
+        <w:top w:w="0" w:type="dxa"/>
+        <w:left w:w="108" w:type="dxa"/>
+        <w:bottom w:w="0" w:type="dxa"/>
+        <w:right w:w="108" w:type="dxa"/>
+      </w:tblCellMar>
     </w:tblPr>
     <w:tcPr>
       <w:shd w:val="clear" w:color="auto" w:fill="4BACC6" w:themeFill="accent5"/>
@@ -10450,6 +10378,13 @@
     <w:tblPr>
       <w:tblStyleRowBandSize w:val="1"/>
       <w:tblStyleColBandSize w:val="1"/>
+      <w:tblInd w:w="0" w:type="dxa"/>
+      <w:tblCellMar>
+        <w:top w:w="0" w:type="dxa"/>
+        <w:left w:w="108" w:type="dxa"/>
+        <w:bottom w:w="0" w:type="dxa"/>
+        <w:right w:w="108" w:type="dxa"/>
+      </w:tblCellMar>
     </w:tblPr>
     <w:tcPr>
       <w:shd w:val="clear" w:color="auto" w:fill="F79646" w:themeFill="accent6"/>
@@ -10557,6 +10492,7 @@
     <w:tblPr>
       <w:tblStyleRowBandSize w:val="1"/>
       <w:tblStyleColBandSize w:val="1"/>
+      <w:tblInd w:w="0" w:type="dxa"/>
       <w:tblBorders>
         <w:top w:val="single" w:sz="24" w:space="0" w:color="C0504D" w:themeColor="accent2"/>
         <w:left w:val="single" w:sz="4" w:space="0" w:color="000000" w:themeColor="text1"/>
@@ -10565,6 +10501,12 @@
         <w:insideH w:val="single" w:sz="4" w:space="0" w:color="FFFFFF" w:themeColor="background1"/>
         <w:insideV w:val="single" w:sz="4" w:space="0" w:color="FFFFFF" w:themeColor="background1"/>
       </w:tblBorders>
+      <w:tblCellMar>
+        <w:top w:w="0" w:type="dxa"/>
+        <w:left w:w="108" w:type="dxa"/>
+        <w:bottom w:w="0" w:type="dxa"/>
+        <w:right w:w="108" w:type="dxa"/>
+      </w:tblCellMar>
     </w:tblPr>
     <w:tcPr>
       <w:shd w:val="clear" w:color="auto" w:fill="E6E6E6" w:themeFill="text1" w:themeFillTint="19"/>
@@ -10672,6 +10614,7 @@
     <w:tblPr>
       <w:tblStyleRowBandSize w:val="1"/>
       <w:tblStyleColBandSize w:val="1"/>
+      <w:tblInd w:w="0" w:type="dxa"/>
       <w:tblBorders>
         <w:top w:val="single" w:sz="24" w:space="0" w:color="C0504D" w:themeColor="accent2"/>
         <w:left w:val="single" w:sz="4" w:space="0" w:color="4F81BD" w:themeColor="accent1"/>
@@ -10680,6 +10623,12 @@
         <w:insideH w:val="single" w:sz="4" w:space="0" w:color="FFFFFF" w:themeColor="background1"/>
         <w:insideV w:val="single" w:sz="4" w:space="0" w:color="FFFFFF" w:themeColor="background1"/>
       </w:tblBorders>
+      <w:tblCellMar>
+        <w:top w:w="0" w:type="dxa"/>
+        <w:left w:w="108" w:type="dxa"/>
+        <w:bottom w:w="0" w:type="dxa"/>
+        <w:right w:w="108" w:type="dxa"/>
+      </w:tblCellMar>
     </w:tblPr>
     <w:tcPr>
       <w:shd w:val="clear" w:color="auto" w:fill="EDF2F8" w:themeFill="accent1" w:themeFillTint="19"/>
@@ -10787,6 +10736,7 @@
     <w:tblPr>
       <w:tblStyleRowBandSize w:val="1"/>
       <w:tblStyleColBandSize w:val="1"/>
+      <w:tblInd w:w="0" w:type="dxa"/>
       <w:tblBorders>
         <w:top w:val="single" w:sz="24" w:space="0" w:color="C0504D" w:themeColor="accent2"/>
         <w:left w:val="single" w:sz="4" w:space="0" w:color="C0504D" w:themeColor="accent2"/>
@@ -10795,6 +10745,12 @@
         <w:insideH w:val="single" w:sz="4" w:space="0" w:color="FFFFFF" w:themeColor="background1"/>
         <w:insideV w:val="single" w:sz="4" w:space="0" w:color="FFFFFF" w:themeColor="background1"/>
       </w:tblBorders>
+      <w:tblCellMar>
+        <w:top w:w="0" w:type="dxa"/>
+        <w:left w:w="108" w:type="dxa"/>
+        <w:bottom w:w="0" w:type="dxa"/>
+        <w:right w:w="108" w:type="dxa"/>
+      </w:tblCellMar>
     </w:tblPr>
     <w:tcPr>
       <w:shd w:val="clear" w:color="auto" w:fill="F8EDED" w:themeFill="accent2" w:themeFillTint="19"/>
@@ -10902,6 +10858,7 @@
     <w:tblPr>
       <w:tblStyleRowBandSize w:val="1"/>
       <w:tblStyleColBandSize w:val="1"/>
+      <w:tblInd w:w="0" w:type="dxa"/>
       <w:tblBorders>
         <w:top w:val="single" w:sz="24" w:space="0" w:color="8064A2" w:themeColor="accent4"/>
         <w:left w:val="single" w:sz="4" w:space="0" w:color="9BBB59" w:themeColor="accent3"/>
@@ -10910,6 +10867,12 @@
         <w:insideH w:val="single" w:sz="4" w:space="0" w:color="FFFFFF" w:themeColor="background1"/>
         <w:insideV w:val="single" w:sz="4" w:space="0" w:color="FFFFFF" w:themeColor="background1"/>
       </w:tblBorders>
+      <w:tblCellMar>
+        <w:top w:w="0" w:type="dxa"/>
+        <w:left w:w="108" w:type="dxa"/>
+        <w:bottom w:w="0" w:type="dxa"/>
+        <w:right w:w="108" w:type="dxa"/>
+      </w:tblCellMar>
     </w:tblPr>
     <w:tcPr>
       <w:shd w:val="clear" w:color="auto" w:fill="F5F8EE" w:themeFill="accent3" w:themeFillTint="19"/>
@@ -11007,6 +10970,7 @@
     <w:tblPr>
       <w:tblStyleRowBandSize w:val="1"/>
       <w:tblStyleColBandSize w:val="1"/>
+      <w:tblInd w:w="0" w:type="dxa"/>
       <w:tblBorders>
         <w:top w:val="single" w:sz="24" w:space="0" w:color="9BBB59" w:themeColor="accent3"/>
         <w:left w:val="single" w:sz="4" w:space="0" w:color="8064A2" w:themeColor="accent4"/>
@@ -11015,6 +10979,12 @@
         <w:insideH w:val="single" w:sz="4" w:space="0" w:color="FFFFFF" w:themeColor="background1"/>
         <w:insideV w:val="single" w:sz="4" w:space="0" w:color="FFFFFF" w:themeColor="background1"/>
       </w:tblBorders>
+      <w:tblCellMar>
+        <w:top w:w="0" w:type="dxa"/>
+        <w:left w:w="108" w:type="dxa"/>
+        <w:bottom w:w="0" w:type="dxa"/>
+        <w:right w:w="108" w:type="dxa"/>
+      </w:tblCellMar>
     </w:tblPr>
     <w:tcPr>
       <w:shd w:val="clear" w:color="auto" w:fill="F2EFF6" w:themeFill="accent4" w:themeFillTint="19"/>
@@ -11122,6 +11092,7 @@
     <w:tblPr>
       <w:tblStyleRowBandSize w:val="1"/>
       <w:tblStyleColBandSize w:val="1"/>
+      <w:tblInd w:w="0" w:type="dxa"/>
       <w:tblBorders>
         <w:top w:val="single" w:sz="24" w:space="0" w:color="F79646" w:themeColor="accent6"/>
         <w:left w:val="single" w:sz="4" w:space="0" w:color="4BACC6" w:themeColor="accent5"/>
@@ -11130,6 +11101,12 @@
         <w:insideH w:val="single" w:sz="4" w:space="0" w:color="FFFFFF" w:themeColor="background1"/>
         <w:insideV w:val="single" w:sz="4" w:space="0" w:color="FFFFFF" w:themeColor="background1"/>
       </w:tblBorders>
+      <w:tblCellMar>
+        <w:top w:w="0" w:type="dxa"/>
+        <w:left w:w="108" w:type="dxa"/>
+        <w:bottom w:w="0" w:type="dxa"/>
+        <w:right w:w="108" w:type="dxa"/>
+      </w:tblCellMar>
     </w:tblPr>
     <w:tcPr>
       <w:shd w:val="clear" w:color="auto" w:fill="EDF6F9" w:themeFill="accent5" w:themeFillTint="19"/>
@@ -11237,6 +11214,7 @@
     <w:tblPr>
       <w:tblStyleRowBandSize w:val="1"/>
       <w:tblStyleColBandSize w:val="1"/>
+      <w:tblInd w:w="0" w:type="dxa"/>
       <w:tblBorders>
         <w:top w:val="single" w:sz="24" w:space="0" w:color="4BACC6" w:themeColor="accent5"/>
         <w:left w:val="single" w:sz="4" w:space="0" w:color="F79646" w:themeColor="accent6"/>
@@ -11245,6 +11223,12 @@
         <w:insideH w:val="single" w:sz="4" w:space="0" w:color="FFFFFF" w:themeColor="background1"/>
         <w:insideV w:val="single" w:sz="4" w:space="0" w:color="FFFFFF" w:themeColor="background1"/>
       </w:tblBorders>
+      <w:tblCellMar>
+        <w:top w:w="0" w:type="dxa"/>
+        <w:left w:w="108" w:type="dxa"/>
+        <w:bottom w:w="0" w:type="dxa"/>
+        <w:right w:w="108" w:type="dxa"/>
+      </w:tblCellMar>
     </w:tblPr>
     <w:tcPr>
       <w:shd w:val="clear" w:color="auto" w:fill="FEF4EC" w:themeFill="accent6" w:themeFillTint="19"/>
@@ -11352,6 +11336,13 @@
     <w:tblPr>
       <w:tblStyleRowBandSize w:val="1"/>
       <w:tblStyleColBandSize w:val="1"/>
+      <w:tblInd w:w="0" w:type="dxa"/>
+      <w:tblCellMar>
+        <w:top w:w="0" w:type="dxa"/>
+        <w:left w:w="108" w:type="dxa"/>
+        <w:bottom w:w="0" w:type="dxa"/>
+        <w:right w:w="108" w:type="dxa"/>
+      </w:tblCellMar>
     </w:tblPr>
     <w:tcPr>
       <w:shd w:val="clear" w:color="auto" w:fill="E6E6E6" w:themeFill="text1" w:themeFillTint="19"/>
@@ -11431,6 +11422,13 @@
     <w:tblPr>
       <w:tblStyleRowBandSize w:val="1"/>
       <w:tblStyleColBandSize w:val="1"/>
+      <w:tblInd w:w="0" w:type="dxa"/>
+      <w:tblCellMar>
+        <w:top w:w="0" w:type="dxa"/>
+        <w:left w:w="108" w:type="dxa"/>
+        <w:bottom w:w="0" w:type="dxa"/>
+        <w:right w:w="108" w:type="dxa"/>
+      </w:tblCellMar>
     </w:tblPr>
     <w:tcPr>
       <w:shd w:val="clear" w:color="auto" w:fill="EDF2F8" w:themeFill="accent1" w:themeFillTint="19"/>
@@ -11510,6 +11508,13 @@
     <w:tblPr>
       <w:tblStyleRowBandSize w:val="1"/>
       <w:tblStyleColBandSize w:val="1"/>
+      <w:tblInd w:w="0" w:type="dxa"/>
+      <w:tblCellMar>
+        <w:top w:w="0" w:type="dxa"/>
+        <w:left w:w="108" w:type="dxa"/>
+        <w:bottom w:w="0" w:type="dxa"/>
+        <w:right w:w="108" w:type="dxa"/>
+      </w:tblCellMar>
     </w:tblPr>
     <w:tcPr>
       <w:shd w:val="clear" w:color="auto" w:fill="F8EDED" w:themeFill="accent2" w:themeFillTint="19"/>
@@ -11589,6 +11594,13 @@
     <w:tblPr>
       <w:tblStyleRowBandSize w:val="1"/>
       <w:tblStyleColBandSize w:val="1"/>
+      <w:tblInd w:w="0" w:type="dxa"/>
+      <w:tblCellMar>
+        <w:top w:w="0" w:type="dxa"/>
+        <w:left w:w="108" w:type="dxa"/>
+        <w:bottom w:w="0" w:type="dxa"/>
+        <w:right w:w="108" w:type="dxa"/>
+      </w:tblCellMar>
     </w:tblPr>
     <w:tcPr>
       <w:shd w:val="clear" w:color="auto" w:fill="F5F8EE" w:themeFill="accent3" w:themeFillTint="19"/>
@@ -11668,6 +11680,13 @@
     <w:tblPr>
       <w:tblStyleRowBandSize w:val="1"/>
       <w:tblStyleColBandSize w:val="1"/>
+      <w:tblInd w:w="0" w:type="dxa"/>
+      <w:tblCellMar>
+        <w:top w:w="0" w:type="dxa"/>
+        <w:left w:w="108" w:type="dxa"/>
+        <w:bottom w:w="0" w:type="dxa"/>
+        <w:right w:w="108" w:type="dxa"/>
+      </w:tblCellMar>
     </w:tblPr>
     <w:tcPr>
       <w:shd w:val="clear" w:color="auto" w:fill="F2EFF6" w:themeFill="accent4" w:themeFillTint="19"/>
@@ -11747,6 +11766,13 @@
     <w:tblPr>
       <w:tblStyleRowBandSize w:val="1"/>
       <w:tblStyleColBandSize w:val="1"/>
+      <w:tblInd w:w="0" w:type="dxa"/>
+      <w:tblCellMar>
+        <w:top w:w="0" w:type="dxa"/>
+        <w:left w:w="108" w:type="dxa"/>
+        <w:bottom w:w="0" w:type="dxa"/>
+        <w:right w:w="108" w:type="dxa"/>
+      </w:tblCellMar>
     </w:tblPr>
     <w:tcPr>
       <w:shd w:val="clear" w:color="auto" w:fill="EDF6F9" w:themeFill="accent5" w:themeFillTint="19"/>
@@ -11826,6 +11852,13 @@
     <w:tblPr>
       <w:tblStyleRowBandSize w:val="1"/>
       <w:tblStyleColBandSize w:val="1"/>
+      <w:tblInd w:w="0" w:type="dxa"/>
+      <w:tblCellMar>
+        <w:top w:w="0" w:type="dxa"/>
+        <w:left w:w="108" w:type="dxa"/>
+        <w:bottom w:w="0" w:type="dxa"/>
+        <w:right w:w="108" w:type="dxa"/>
+      </w:tblCellMar>
     </w:tblPr>
     <w:tcPr>
       <w:shd w:val="clear" w:color="auto" w:fill="FEF4EC" w:themeFill="accent6" w:themeFillTint="19"/>
@@ -11905,9 +11938,16 @@
     <w:tblPr>
       <w:tblStyleRowBandSize w:val="1"/>
       <w:tblStyleColBandSize w:val="1"/>
+      <w:tblInd w:w="0" w:type="dxa"/>
       <w:tblBorders>
         <w:insideH w:val="single" w:sz="4" w:space="0" w:color="FFFFFF" w:themeColor="background1"/>
       </w:tblBorders>
+      <w:tblCellMar>
+        <w:top w:w="0" w:type="dxa"/>
+        <w:left w:w="108" w:type="dxa"/>
+        <w:bottom w:w="0" w:type="dxa"/>
+        <w:right w:w="108" w:type="dxa"/>
+      </w:tblCellMar>
     </w:tblPr>
     <w:tcPr>
       <w:shd w:val="clear" w:color="auto" w:fill="CCCCCC" w:themeFill="text1" w:themeFillTint="33"/>
@@ -11978,9 +12018,16 @@
     <w:tblPr>
       <w:tblStyleRowBandSize w:val="1"/>
       <w:tblStyleColBandSize w:val="1"/>
+      <w:tblInd w:w="0" w:type="dxa"/>
       <w:tblBorders>
         <w:insideH w:val="single" w:sz="4" w:space="0" w:color="FFFFFF" w:themeColor="background1"/>
       </w:tblBorders>
+      <w:tblCellMar>
+        <w:top w:w="0" w:type="dxa"/>
+        <w:left w:w="108" w:type="dxa"/>
+        <w:bottom w:w="0" w:type="dxa"/>
+        <w:right w:w="108" w:type="dxa"/>
+      </w:tblCellMar>
     </w:tblPr>
     <w:tcPr>
       <w:shd w:val="clear" w:color="auto" w:fill="DBE5F1" w:themeFill="accent1" w:themeFillTint="33"/>
@@ -12051,9 +12098,16 @@
     <w:tblPr>
       <w:tblStyleRowBandSize w:val="1"/>
       <w:tblStyleColBandSize w:val="1"/>
+      <w:tblInd w:w="0" w:type="dxa"/>
       <w:tblBorders>
         <w:insideH w:val="single" w:sz="4" w:space="0" w:color="FFFFFF" w:themeColor="background1"/>
       </w:tblBorders>
+      <w:tblCellMar>
+        <w:top w:w="0" w:type="dxa"/>
+        <w:left w:w="108" w:type="dxa"/>
+        <w:bottom w:w="0" w:type="dxa"/>
+        <w:right w:w="108" w:type="dxa"/>
+      </w:tblCellMar>
     </w:tblPr>
     <w:tcPr>
       <w:shd w:val="clear" w:color="auto" w:fill="F2DBDB" w:themeFill="accent2" w:themeFillTint="33"/>
@@ -12124,9 +12178,16 @@
     <w:tblPr>
       <w:tblStyleRowBandSize w:val="1"/>
       <w:tblStyleColBandSize w:val="1"/>
+      <w:tblInd w:w="0" w:type="dxa"/>
       <w:tblBorders>
         <w:insideH w:val="single" w:sz="4" w:space="0" w:color="FFFFFF" w:themeColor="background1"/>
       </w:tblBorders>
+      <w:tblCellMar>
+        <w:top w:w="0" w:type="dxa"/>
+        <w:left w:w="108" w:type="dxa"/>
+        <w:bottom w:w="0" w:type="dxa"/>
+        <w:right w:w="108" w:type="dxa"/>
+      </w:tblCellMar>
     </w:tblPr>
     <w:tcPr>
       <w:shd w:val="clear" w:color="auto" w:fill="EAF1DD" w:themeFill="accent3" w:themeFillTint="33"/>
@@ -12197,9 +12258,16 @@
     <w:tblPr>
       <w:tblStyleRowBandSize w:val="1"/>
       <w:tblStyleColBandSize w:val="1"/>
+      <w:tblInd w:w="0" w:type="dxa"/>
       <w:tblBorders>
         <w:insideH w:val="single" w:sz="4" w:space="0" w:color="FFFFFF" w:themeColor="background1"/>
       </w:tblBorders>
+      <w:tblCellMar>
+        <w:top w:w="0" w:type="dxa"/>
+        <w:left w:w="108" w:type="dxa"/>
+        <w:bottom w:w="0" w:type="dxa"/>
+        <w:right w:w="108" w:type="dxa"/>
+      </w:tblCellMar>
     </w:tblPr>
     <w:tcPr>
       <w:shd w:val="clear" w:color="auto" w:fill="E5DFEC" w:themeFill="accent4" w:themeFillTint="33"/>
@@ -12270,9 +12338,16 @@
     <w:tblPr>
       <w:tblStyleRowBandSize w:val="1"/>
       <w:tblStyleColBandSize w:val="1"/>
+      <w:tblInd w:w="0" w:type="dxa"/>
       <w:tblBorders>
         <w:insideH w:val="single" w:sz="4" w:space="0" w:color="FFFFFF" w:themeColor="background1"/>
       </w:tblBorders>
+      <w:tblCellMar>
+        <w:top w:w="0" w:type="dxa"/>
+        <w:left w:w="108" w:type="dxa"/>
+        <w:bottom w:w="0" w:type="dxa"/>
+        <w:right w:w="108" w:type="dxa"/>
+      </w:tblCellMar>
     </w:tblPr>
     <w:tcPr>
       <w:shd w:val="clear" w:color="auto" w:fill="DAEEF3" w:themeFill="accent5" w:themeFillTint="33"/>
@@ -12343,9 +12418,16 @@
     <w:tblPr>
       <w:tblStyleRowBandSize w:val="1"/>
       <w:tblStyleColBandSize w:val="1"/>
+      <w:tblInd w:w="0" w:type="dxa"/>
       <w:tblBorders>
         <w:insideH w:val="single" w:sz="4" w:space="0" w:color="FFFFFF" w:themeColor="background1"/>
       </w:tblBorders>
+      <w:tblCellMar>
+        <w:top w:w="0" w:type="dxa"/>
+        <w:left w:w="108" w:type="dxa"/>
+        <w:bottom w:w="0" w:type="dxa"/>
+        <w:right w:w="108" w:type="dxa"/>
+      </w:tblCellMar>
     </w:tblPr>
     <w:tcPr>
       <w:shd w:val="clear" w:color="auto" w:fill="FDE9D9" w:themeFill="accent6" w:themeFillTint="33"/>

</xml_diff>